<commit_message>
add role b section to team report
</commit_message>
<xml_diff>
--- a/Team_Report.docx
+++ b/Team_Report.docx
@@ -11576,6 +11576,376 @@
       <w:cols w:space="708"/>
       <w:docGrid w:linePitch="360"/>
     </w:sectPr>
+    <w:p>
+      <w:r>
+        <w:br w:type="page"/>
+      </w:r>
+    </w:p>
+    <w:p>
+      <w:r>
+        <w:t xml:space="preserve">3. ROLE B- POLICY BASED METHODS</w:t>
+      </w:r>
+    </w:p>
+    <w:p>
+      <w:r>
+        <w:t xml:space="preserve"/>
+      </w:r>
+    </w:p>
+    <w:p>
+      <w:r>
+        <w:t xml:space="preserve">In this section, policy-based reinforcement learning and actor-critic methods are developed and tested on the DroneDispatch-v0 environment. The main method used in this role is Advantage Actor-Critic (A2C). In addition to the standard A2C implementation, behavior cloning from the Greedy Nearest policy and a behavior cloning warm-start experiment were also tested. Finally, an ablation study was performed by removing advantage normalization.</w:t>
+      </w:r>
+    </w:p>
+    <w:p>
+      <w:r>
+        <w:t xml:space="preserve"/>
+      </w:r>
+    </w:p>
+    <w:p>
+      <w:r>
+        <w:t xml:space="preserve">3.1 Environment Structure</w:t>
+      </w:r>
+    </w:p>
+    <w:p>
+      <w:r>
+        <w:t xml:space="preserve"/>
+      </w:r>
+    </w:p>
+    <w:p>
+      <w:r>
+        <w:t xml:space="preserve">For Role B, the same DroneDispatch-v0 environment was used. The environment has 8 drones and a maximum visible order window of 20 orders. The action space has 169 discrete actions in total. These actions include assigning a drone to an order, sending an idle drone to a charger, or choosing a no-op action.</w:t>
+      </w:r>
+    </w:p>
+    <w:p>
+      <w:r>
+        <w:t xml:space="preserve"/>
+      </w:r>
+    </w:p>
+    <w:p>
+      <w:r>
+        <w:t xml:space="preserve">The observation space is given as a dictionary. In our implementation, the drone vector, order vector, and time variable were flattened and combined into a single 181-dimensional state vector. The grid layout was not included in the first model in order to keep the policy network simple. Also, the action mask was used during training and evaluation. This prevented the policy from selecting invalid actions.</w:t>
+      </w:r>
+    </w:p>
+    <w:p>
+      <w:r>
+        <w:t xml:space="preserve"/>
+      </w:r>
+    </w:p>
+    <w:p>
+      <w:r>
+        <w:t xml:space="preserve">3.2 A2C Implementation</w:t>
+      </w:r>
+    </w:p>
+    <w:p>
+      <w:r>
+        <w:t xml:space="preserve"/>
+      </w:r>
+    </w:p>
+    <w:p>
+      <w:r>
+        <w:t xml:space="preserve">The main policy-based model was implemented using an Actor-Critic network. The network has a shared multilayer structure and two separate output heads. The actor head produces action logits for the 169 discrete actions. The critic head estimates the state value.</w:t>
+      </w:r>
+    </w:p>
+    <w:p>
+      <w:r>
+        <w:t xml:space="preserve"/>
+      </w:r>
+    </w:p>
+    <w:p>
+      <w:r>
+        <w:t xml:space="preserve">During training, the agent collects rollout steps from the environment. Then, Generalized Advantage Estimation (GAE) is used to calculate the advantage values. These advantage values are used in the policy loss. The critic is trained with mean squared error between the predicted value and the return target. An entropy term is also added to encourage exploration.</w:t>
+      </w:r>
+    </w:p>
+    <w:p>
+      <w:r>
+        <w:t xml:space="preserve"/>
+      </w:r>
+    </w:p>
+    <w:p>
+      <w:r>
+        <w:t xml:space="preserve">The total loss consists of three parts: Policy loss + Value loss - Entropy bonus.</w:t>
+      </w:r>
+    </w:p>
+    <w:p>
+      <w:r>
+        <w:t xml:space="preserve"/>
+      </w:r>
+    </w:p>
+    <w:p>
+      <w:r>
+        <w:t xml:space="preserve">In the main A2C experiment, advantage normalization was used to make the learning process more stable. Because of package installation problems on the local computer, a small manual Adam optimizer was implemented instead of using torch.optim.Adam. This did not change the learning logic, but it made the code runnable in the available environment.</w:t>
+      </w:r>
+    </w:p>
+    <w:p>
+      <w:r>
+        <w:t xml:space="preserve"/>
+      </w:r>
+    </w:p>
+    <w:p>
+      <w:r>
+        <w:t xml:space="preserve">3.3 Experimental Setup</w:t>
+      </w:r>
+    </w:p>
+    <w:p>
+      <w:r>
+        <w:t xml:space="preserve"/>
+      </w:r>
+    </w:p>
+    <w:p>
+      <w:r>
+        <w:t xml:space="preserve">All Role B experiments were run with the standard evaluation configuration and seeds 0, 1, and 2. The model parameters were stored in YAML configuration files. At the end of each training, model weights (.pt), logs (.csv), and evaluation results (.json) were saved.</w:t>
+      </w:r>
+    </w:p>
+    <w:p>
+      <w:r>
+        <w:t xml:space="preserve"/>
+      </w:r>
+    </w:p>
+    <w:p>
+      <w:r>
+        <w:t xml:space="preserve">The following methods were tested:</w:t>
+      </w:r>
+    </w:p>
+    <w:p>
+      <w:r>
+        <w:t xml:space="preserve">- Vanilla A2C</w:t>
+      </w:r>
+    </w:p>
+    <w:p>
+      <w:r>
+        <w:t xml:space="preserve">- Behavior Cloning from Greedy Nearest</w:t>
+      </w:r>
+    </w:p>
+    <w:p>
+      <w:r>
+        <w:t xml:space="preserve">- Behavior Cloning Warm-Start + A2C Fine-Tuning</w:t>
+      </w:r>
+    </w:p>
+    <w:p>
+      <w:r>
+        <w:t xml:space="preserve">- A2C without Advantage Normalization</w:t>
+      </w:r>
+    </w:p>
+    <w:p>
+      <w:r>
+        <w:t xml:space="preserve"/>
+      </w:r>
+    </w:p>
+    <w:p>
+      <w:r>
+        <w:t xml:space="preserve">The baseline methods used for comparison were Random Policy, Greedy Nearest, and MILP Rolling.</w:t>
+      </w:r>
+    </w:p>
+    <w:p>
+      <w:r>
+        <w:t xml:space="preserve"/>
+      </w:r>
+    </w:p>
+    <w:p>
+      <w:r>
+        <w:t xml:space="preserve">The baseline results are as follows:</w:t>
+      </w:r>
+    </w:p>
+    <w:p>
+      <w:r>
+        <w:t xml:space="preserve">- Random Policy Cost per Order: 18.780</w:t>
+      </w:r>
+    </w:p>
+    <w:p>
+      <w:r>
+        <w:t xml:space="preserve">- Greedy Nearest Cost per Order: 4.570</w:t>
+      </w:r>
+    </w:p>
+    <w:p>
+      <w:r>
+        <w:t xml:space="preserve">- MILP Rolling Cost per Order: 4.722</w:t>
+      </w:r>
+    </w:p>
+    <w:p>
+      <w:r>
+        <w:t xml:space="preserve"/>
+      </w:r>
+    </w:p>
+    <w:p>
+      <w:r>
+        <w:t xml:space="preserve">According to the main metric, Greedy Nearest was the strongest baseline. Therefore, it was used as the main comparison point for Role B.</w:t>
+      </w:r>
+    </w:p>
+    <w:p>
+      <w:r>
+        <w:t xml:space="preserve"/>
+      </w:r>
+    </w:p>
+    <w:p>
+      <w:r>
+        <w:t xml:space="preserve">3.4 Behavior Cloning Warm-Start</w:t>
+      </w:r>
+    </w:p>
+    <w:p>
+      <w:r>
+        <w:t xml:space="preserve"/>
+      </w:r>
+    </w:p>
+    <w:p>
+      <w:r>
+        <w:t xml:space="preserve">After the vanilla A2C experiment, behavior cloning was tested as a warm-start method. In this method, the actor network was first trained to imitate the Greedy Nearest policy. The idea was to start the policy from a more meaningful dispatching behavior instead of a random policy.</w:t>
+      </w:r>
+    </w:p>
+    <w:p>
+      <w:r>
+        <w:t xml:space="preserve"/>
+      </w:r>
+    </w:p>
+    <w:p>
+      <w:r>
+        <w:t xml:space="preserve">The behavior cloning model was trained using expert state-action pairs collected from the Greedy Nearest policy. After 8 epochs, the imitation accuracy reached approximately 0.337. This means that the model learned some expert-like behavior, but it could not reliably copy the Greedy Nearest policy.</w:t>
+      </w:r>
+    </w:p>
+    <w:p>
+      <w:r>
+        <w:t xml:space="preserve"/>
+      </w:r>
+    </w:p>
+    <w:p>
+      <w:r>
+        <w:t xml:space="preserve">Then, this behavior cloning model was used as the initial model for A2C fine-tuning. The aim was to improve the cloned policy with reinforcement learning.</w:t>
+      </w:r>
+    </w:p>
+    <w:p>
+      <w:r>
+        <w:t xml:space="preserve"/>
+      </w:r>
+    </w:p>
+    <w:p>
+      <w:r>
+        <w:t xml:space="preserve">3.5 Ablation Study</w:t>
+      </w:r>
+    </w:p>
+    <w:p>
+      <w:r>
+        <w:t xml:space="preserve"/>
+      </w:r>
+    </w:p>
+    <w:p>
+      <w:r>
+        <w:t xml:space="preserve">For the ablation study, the effect of advantage normalization was tested. In the main A2C model, advantage normalization was used. In the ablation experiment, the same A2C structure was trained again, but advantage normalization was turned off.</w:t>
+      </w:r>
+    </w:p>
+    <w:p>
+      <w:r>
+        <w:t xml:space="preserve"/>
+      </w:r>
+    </w:p>
+    <w:p>
+      <w:r>
+        <w:t xml:space="preserve">This comparison showed that removing advantage normalization made the results worse. With advantage normalization, vanilla A2C achieved a cost per order of 24.371. Without advantage normalization, the cost per order increased to 35.832. Therefore, advantage normalization helped stabilize the A2C training, even though it was not enough to reach the Greedy Nearest baseline.</w:t>
+      </w:r>
+    </w:p>
+    <w:p>
+      <w:r>
+        <w:t xml:space="preserve"/>
+      </w:r>
+    </w:p>
+    <w:p>
+      <w:r>
+        <w:t xml:space="preserve">3.6 Results and Evaluation</w:t>
+      </w:r>
+    </w:p>
+    <w:p>
+      <w:r>
+        <w:t xml:space="preserve"/>
+      </w:r>
+    </w:p>
+    <w:p>
+      <w:r>
+        <w:t xml:space="preserve">The Role B results are summarized below.</w:t>
+      </w:r>
+    </w:p>
+    <w:p>
+      <w:r>
+        <w:t xml:space="preserve"/>
+      </w:r>
+    </w:p>
+    <w:p>
+      <w:r>
+        <w:t xml:space="preserve">Method | Cost per Order | Success Rate | On-Time Rate | Delivered Orders | Dropped Orders | Episode Return</w:t>
+      </w:r>
+    </w:p>
+    <w:p>
+      <w:r>
+        <w:t xml:space="preserve">Random Policy | 18.780 | 0.653 | 0.890 | 39.67 | 21.67 | -168.33</w:t>
+      </w:r>
+    </w:p>
+    <w:p>
+      <w:r>
+        <w:t xml:space="preserve">Greedy Nearest | 4.570 | 0.855 | 0.903 | 118.33 | 20.00 | 1183.26</w:t>
+      </w:r>
+    </w:p>
+    <w:p>
+      <w:r>
+        <w:t xml:space="preserve">MILP Rolling | 4.722 | 0.836 | 0.911 | 118.00 | 23.00 | 1173.00</w:t>
+      </w:r>
+    </w:p>
+    <w:p>
+      <w:r>
+        <w:t xml:space="preserve">Vanilla A2C | 24.371 | 0.618 | 0.948 | 27.67 | 17.67 | -267.35</w:t>
+      </w:r>
+    </w:p>
+    <w:p>
+      <w:r>
+        <w:t xml:space="preserve">Behavior Cloning | 30.031 | 0.453 | 0.937 | 62.67 | 73.33 | -446.05</w:t>
+      </w:r>
+    </w:p>
+    <w:p>
+      <w:r>
+        <w:t xml:space="preserve">BC Warm-Start + A2C | 26.713 | 0.409 | 0.807 | 55.33 | 80.00 | -700.71</w:t>
+      </w:r>
+    </w:p>
+    <w:p>
+      <w:r>
+        <w:t xml:space="preserve">A2C without Advantage Normalization | 35.832 | 0.438 | 0.948 | 25.00 | 32.33 | -527.42</w:t>
+      </w:r>
+    </w:p>
+    <w:p>
+      <w:r>
+        <w:t xml:space="preserve"/>
+      </w:r>
+    </w:p>
+    <w:p>
+      <w:r>
+        <w:t xml:space="preserve">The vanilla A2C model was trained for 50,000 steps. The training and evaluation pipeline worked correctly. The model interacted with the environment, used the action mask, saved weights, and produced evaluation metrics. However, the final performance was not competitive. The vanilla A2C model achieved a cost per order of 24.371, which was worse than both Random Policy and Greedy Nearest.</w:t>
+      </w:r>
+    </w:p>
+    <w:p>
+      <w:r>
+        <w:t xml:space="preserve"/>
+      </w:r>
+    </w:p>
+    <w:p>
+      <w:r>
+        <w:t xml:space="preserve">This result shows that learning a good dispatching policy from scratch is difficult in this environment. The action space is large, the rewards are delayed, and the agent must learn order assignment, battery management, charging behavior, and delivery deadlines at the same time. On the other hand, Greedy Nearest is already a strong hand-designed rule for this problem.</w:t>
+      </w:r>
+    </w:p>
+    <w:p>
+      <w:r>
+        <w:t xml:space="preserve"/>
+      </w:r>
+    </w:p>
+    <w:p>
+      <w:r>
+        <w:t xml:space="preserve">The behavior cloning model also could not reach the performance of Greedy Nearest. Although it imitated some expert actions, its accuracy was not high enough. Small mistakes in action selection caused many dropped orders. The BC warm-start + A2C fine-tuning experiment improved the direct behavior cloning cost from 30.031 to 26.713, but it was still not better than vanilla A2C.</w:t>
+      </w:r>
+    </w:p>
+    <w:p>
+      <w:r>
+        <w:t xml:space="preserve"/>
+      </w:r>
+    </w:p>
+    <w:p>
+      <w:r>
+        <w:t xml:space="preserve">In conclusion, the Role B models were successfully integrated into the simulator and evaluated with saved logs and weights. The learned policies did not pass the Greedy Nearest baseline. However, the experiments clearly showed why policy-gradient learning is difficult in this dispatching environment. The results also showed that advantage normalization is useful for stabilizing A2C, while behavior cloning warm-start needs stronger imitation accuracy to become effective.</w:t>
+      </w:r>
+    </w:p>
   </w:body>
 </w:document>
 </file>

</xml_diff>

<commit_message>
update role b section with table in team report
</commit_message>
<xml_diff>
--- a/Team_Report.docx
+++ b/Team_Report.docx
@@ -11570,6 +11570,865 @@
         <w:t>.</w:t>
       </w:r>
     </w:p>
+    <w:p>
+      <w:r>
+        <w:br w:type="page"/>
+      </w:r>
+    </w:p>
+    <w:p>
+      <w:r>
+        <w:rPr>
+          <w:b/>
+        </w:rPr>
+        <w:t xml:space="preserve">3. ROLE B- POLICY BASED METHODS</w:t>
+      </w:r>
+    </w:p>
+    <w:p>
+      <w:r>
+        <w:rPr/>
+        <w:t xml:space="preserve">In this section, policy-based reinforcement learning and actor-critic methods are developed and tested on the DroneDispatch-v0 environment. The main method used in this role is Advantage Actor-Critic (A2C). In addition to the standard A2C implementation, behavior cloning from the Greedy Nearest policy and a behavior cloning warm-start experiment were also tested. Finally, an ablation study was performed by removing advantage normalization.</w:t>
+      </w:r>
+    </w:p>
+    <w:p>
+      <w:r>
+        <w:rPr>
+          <w:b/>
+        </w:rPr>
+        <w:t xml:space="preserve">3.1 Environment Structure</w:t>
+      </w:r>
+    </w:p>
+    <w:p>
+      <w:r>
+        <w:rPr/>
+        <w:t xml:space="preserve">For Role B, the same DroneDispatch-v0 environment was used. The environment has 8 drones and a maximum visible order window of 20 orders. The action space has 169 discrete actions in total. These actions include assigning a drone to an order, sending an idle drone to a charger, or choosing a no-op action.</w:t>
+      </w:r>
+    </w:p>
+    <w:p>
+      <w:r>
+        <w:rPr/>
+        <w:t xml:space="preserve">The observation space is given as a dictionary. In our implementation, the drone vector, order vector, and time variable were flattened and combined into a single 181-dimensional state vector. The grid layout was not included in the first model in order to keep the policy network simple. Also, the action mask was used during training and evaluation. This prevented the policy from selecting invalid actions.</w:t>
+      </w:r>
+    </w:p>
+    <w:p>
+      <w:r>
+        <w:rPr>
+          <w:b/>
+        </w:rPr>
+        <w:t xml:space="preserve">3.2 A2C Implementation</w:t>
+      </w:r>
+    </w:p>
+    <w:p>
+      <w:r>
+        <w:rPr/>
+        <w:t xml:space="preserve">The main policy-based model was implemented using an Actor-Critic network. The network has a shared multilayer structure and two separate output heads. The actor head produces action logits for the 169 discrete actions. The critic head estimates the state value.</w:t>
+      </w:r>
+    </w:p>
+    <w:p>
+      <w:r>
+        <w:rPr/>
+        <w:t xml:space="preserve">During training, the agent collects rollout steps from the environment. Then, Generalized Advantage Estimation (GAE) is used to calculate the advantage values. These advantage values are used in the policy loss. The critic is trained with mean squared error between the predicted value and the return target. An entropy term is also added to encourage exploration.</w:t>
+      </w:r>
+    </w:p>
+    <w:p>
+      <w:r>
+        <w:rPr/>
+        <w:t xml:space="preserve">The total loss consists of three parts: Policy loss + Value loss - Entropy bonus.</w:t>
+      </w:r>
+    </w:p>
+    <w:p>
+      <w:r>
+        <w:rPr/>
+        <w:t xml:space="preserve">In the main A2C experiment, advantage normalization was used to make the learning process more stable. Because of package installation problems on the local computer, a small manual Adam optimizer was implemented instead of using torch.optim.Adam. This did not change the learning logic, but it made the code runnable in the available environment.</w:t>
+      </w:r>
+    </w:p>
+    <w:p>
+      <w:r>
+        <w:rPr>
+          <w:b/>
+        </w:rPr>
+        <w:t xml:space="preserve">3.3 Experimental Setup</w:t>
+      </w:r>
+    </w:p>
+    <w:p>
+      <w:r>
+        <w:rPr/>
+        <w:t xml:space="preserve">All Role B experiments were run with the standard evaluation configuration and seeds 0, 1, and 2. The model parameters were stored in YAML configuration files. At the end of each training, model weights (.pt), logs (.csv), and evaluation results (.json) were saved.</w:t>
+      </w:r>
+    </w:p>
+    <w:p>
+      <w:r>
+        <w:rPr/>
+        <w:t xml:space="preserve">The following methods were tested: Vanilla A2C, Behavior Cloning from Greedy Nearest, Behavior Cloning Warm-Start + A2C Fine-Tuning, and A2C without Advantage Normalization.</w:t>
+      </w:r>
+    </w:p>
+    <w:p>
+      <w:r>
+        <w:rPr/>
+        <w:t xml:space="preserve">The baseline methods used for comparison were Random Policy, Greedy Nearest, and MILP Rolling.</w:t>
+      </w:r>
+    </w:p>
+    <w:p>
+      <w:r>
+        <w:rPr/>
+        <w:t xml:space="preserve">The baseline results are as follows: Random Policy Cost per Order: 18.780, Greedy Nearest Cost per Order: 4.570, and MILP Rolling Cost per Order: 4.722.</w:t>
+      </w:r>
+    </w:p>
+    <w:p>
+      <w:r>
+        <w:rPr/>
+        <w:t xml:space="preserve">According to the main metric, Greedy Nearest was the strongest baseline. Therefore, it was used as the main comparison point for Role B.</w:t>
+      </w:r>
+    </w:p>
+    <w:p>
+      <w:r>
+        <w:rPr>
+          <w:b/>
+        </w:rPr>
+        <w:t xml:space="preserve">3.4 Behavior Cloning Warm-Start</w:t>
+      </w:r>
+    </w:p>
+    <w:p>
+      <w:r>
+        <w:rPr/>
+        <w:t xml:space="preserve">After the vanilla A2C experiment, behavior cloning was tested as a warm-start method. In this method, the actor network was first trained to imitate the Greedy Nearest policy. The idea was to start the policy from a more meaningful dispatching behavior instead of a random policy.</w:t>
+      </w:r>
+    </w:p>
+    <w:p>
+      <w:r>
+        <w:rPr/>
+        <w:t xml:space="preserve">The behavior cloning model was trained using expert state-action pairs collected from the Greedy Nearest policy. After 8 epochs, the imitation accuracy reached approximately 0.337. This means that the model learned some expert-like behavior, but it could not reliably copy the Greedy Nearest policy.</w:t>
+      </w:r>
+    </w:p>
+    <w:p>
+      <w:r>
+        <w:rPr/>
+        <w:t xml:space="preserve">Then, this behavior cloning model was used as the initial model for A2C fine-tuning. The aim was to improve the cloned policy with reinforcement learning.</w:t>
+      </w:r>
+    </w:p>
+    <w:p>
+      <w:r>
+        <w:rPr>
+          <w:b/>
+        </w:rPr>
+        <w:t xml:space="preserve">3.5 Ablation Study</w:t>
+      </w:r>
+    </w:p>
+    <w:p>
+      <w:r>
+        <w:rPr/>
+        <w:t xml:space="preserve">For the ablation study, the effect of advantage normalization was tested. In the main A2C model, advantage normalization was used. In the ablation experiment, the same A2C structure was trained again, but advantage normalization was turned off.</w:t>
+      </w:r>
+    </w:p>
+    <w:p>
+      <w:r>
+        <w:rPr/>
+        <w:t xml:space="preserve">This comparison showed that removing advantage normalization made the results worse. With advantage normalization, vanilla A2C achieved a cost per order of 24.371. Without advantage normalization, the cost per order increased to 35.832. Therefore, advantage normalization helped stabilize the A2C training, even though it was not enough to reach the Greedy Nearest baseline.</w:t>
+      </w:r>
+    </w:p>
+    <w:p>
+      <w:r>
+        <w:rPr>
+          <w:b/>
+        </w:rPr>
+        <w:t xml:space="preserve">3.6 Results and Evaluation</w:t>
+      </w:r>
+    </w:p>
+    <w:p>
+      <w:r>
+        <w:rPr/>
+        <w:t xml:space="preserve">The Role B results are summarized in the table below.</w:t>
+      </w:r>
+    </w:p>
+    <w:tbl>
+      <w:tblPr>
+        <w:tblStyle w:val="TableGrid"/>
+        <w:tblW w:w="0" w:type="auto"/>
+        <w:tblBorders>
+          <w:top w:val="single" w:sz="4" w:space="0" w:color="000000"/>
+          <w:left w:val="single" w:sz="4" w:space="0" w:color="000000"/>
+          <w:bottom w:val="single" w:sz="4" w:space="0" w:color="000000"/>
+          <w:right w:val="single" w:sz="4" w:space="0" w:color="000000"/>
+          <w:insideH w:val="single" w:sz="4" w:space="0" w:color="000000"/>
+          <w:insideV w:val="single" w:sz="4" w:space="0" w:color="000000"/>
+        </w:tblBorders>
+      </w:tblPr>
+      <w:tr>
+        <w:tc>
+          <w:tcPr>
+            <w:tcW w:w="1800" w:type="dxa"/>
+          </w:tcPr>
+          <w:p>
+            <w:r>
+              <w:rPr>
+                <w:b/>
+              </w:rPr>
+              <w:t xml:space="preserve">Method</w:t>
+            </w:r>
+          </w:p>
+        </w:tc>
+        <w:tc>
+          <w:tcPr>
+            <w:tcW w:w="1800" w:type="dxa"/>
+          </w:tcPr>
+          <w:p>
+            <w:r>
+              <w:rPr>
+                <w:b/>
+              </w:rPr>
+              <w:t xml:space="preserve">Cost per Order</w:t>
+            </w:r>
+          </w:p>
+        </w:tc>
+        <w:tc>
+          <w:tcPr>
+            <w:tcW w:w="1800" w:type="dxa"/>
+          </w:tcPr>
+          <w:p>
+            <w:r>
+              <w:rPr>
+                <w:b/>
+              </w:rPr>
+              <w:t xml:space="preserve">Success Rate</w:t>
+            </w:r>
+          </w:p>
+        </w:tc>
+        <w:tc>
+          <w:tcPr>
+            <w:tcW w:w="1800" w:type="dxa"/>
+          </w:tcPr>
+          <w:p>
+            <w:r>
+              <w:rPr>
+                <w:b/>
+              </w:rPr>
+              <w:t xml:space="preserve">On-Time Rate</w:t>
+            </w:r>
+          </w:p>
+        </w:tc>
+        <w:tc>
+          <w:tcPr>
+            <w:tcW w:w="1800" w:type="dxa"/>
+          </w:tcPr>
+          <w:p>
+            <w:r>
+              <w:rPr>
+                <w:b/>
+              </w:rPr>
+              <w:t xml:space="preserve">Delivered Orders</w:t>
+            </w:r>
+          </w:p>
+        </w:tc>
+        <w:tc>
+          <w:tcPr>
+            <w:tcW w:w="1800" w:type="dxa"/>
+          </w:tcPr>
+          <w:p>
+            <w:r>
+              <w:rPr>
+                <w:b/>
+              </w:rPr>
+              <w:t xml:space="preserve">Dropped Orders</w:t>
+            </w:r>
+          </w:p>
+        </w:tc>
+        <w:tc>
+          <w:tcPr>
+            <w:tcW w:w="1800" w:type="dxa"/>
+          </w:tcPr>
+          <w:p>
+            <w:r>
+              <w:rPr>
+                <w:b/>
+              </w:rPr>
+              <w:t xml:space="preserve">Episode Return</w:t>
+            </w:r>
+          </w:p>
+        </w:tc>
+      </w:tr>
+      <w:tr>
+        <w:tc>
+          <w:tcPr>
+            <w:tcW w:w="1800" w:type="dxa"/>
+          </w:tcPr>
+          <w:p>
+            <w:r>
+              <w:rPr/>
+              <w:t xml:space="preserve">Random Policy</w:t>
+            </w:r>
+          </w:p>
+        </w:tc>
+        <w:tc>
+          <w:tcPr>
+            <w:tcW w:w="1800" w:type="dxa"/>
+          </w:tcPr>
+          <w:p>
+            <w:r>
+              <w:rPr/>
+              <w:t xml:space="preserve">18.780</w:t>
+            </w:r>
+          </w:p>
+        </w:tc>
+        <w:tc>
+          <w:tcPr>
+            <w:tcW w:w="1800" w:type="dxa"/>
+          </w:tcPr>
+          <w:p>
+            <w:r>
+              <w:rPr/>
+              <w:t xml:space="preserve">0.653</w:t>
+            </w:r>
+          </w:p>
+        </w:tc>
+        <w:tc>
+          <w:tcPr>
+            <w:tcW w:w="1800" w:type="dxa"/>
+          </w:tcPr>
+          <w:p>
+            <w:r>
+              <w:rPr/>
+              <w:t xml:space="preserve">0.890</w:t>
+            </w:r>
+          </w:p>
+        </w:tc>
+        <w:tc>
+          <w:tcPr>
+            <w:tcW w:w="1800" w:type="dxa"/>
+          </w:tcPr>
+          <w:p>
+            <w:r>
+              <w:rPr/>
+              <w:t xml:space="preserve">39.67</w:t>
+            </w:r>
+          </w:p>
+        </w:tc>
+        <w:tc>
+          <w:tcPr>
+            <w:tcW w:w="1800" w:type="dxa"/>
+          </w:tcPr>
+          <w:p>
+            <w:r>
+              <w:rPr/>
+              <w:t xml:space="preserve">21.67</w:t>
+            </w:r>
+          </w:p>
+        </w:tc>
+        <w:tc>
+          <w:tcPr>
+            <w:tcW w:w="1800" w:type="dxa"/>
+          </w:tcPr>
+          <w:p>
+            <w:r>
+              <w:rPr/>
+              <w:t xml:space="preserve">-168.33</w:t>
+            </w:r>
+          </w:p>
+        </w:tc>
+      </w:tr>
+      <w:tr>
+        <w:tc>
+          <w:tcPr>
+            <w:tcW w:w="1800" w:type="dxa"/>
+          </w:tcPr>
+          <w:p>
+            <w:r>
+              <w:rPr/>
+              <w:t xml:space="preserve">Greedy Nearest</w:t>
+            </w:r>
+          </w:p>
+        </w:tc>
+        <w:tc>
+          <w:tcPr>
+            <w:tcW w:w="1800" w:type="dxa"/>
+          </w:tcPr>
+          <w:p>
+            <w:r>
+              <w:rPr/>
+              <w:t xml:space="preserve">4.570</w:t>
+            </w:r>
+          </w:p>
+        </w:tc>
+        <w:tc>
+          <w:tcPr>
+            <w:tcW w:w="1800" w:type="dxa"/>
+          </w:tcPr>
+          <w:p>
+            <w:r>
+              <w:rPr/>
+              <w:t xml:space="preserve">0.855</w:t>
+            </w:r>
+          </w:p>
+        </w:tc>
+        <w:tc>
+          <w:tcPr>
+            <w:tcW w:w="1800" w:type="dxa"/>
+          </w:tcPr>
+          <w:p>
+            <w:r>
+              <w:rPr/>
+              <w:t xml:space="preserve">0.903</w:t>
+            </w:r>
+          </w:p>
+        </w:tc>
+        <w:tc>
+          <w:tcPr>
+            <w:tcW w:w="1800" w:type="dxa"/>
+          </w:tcPr>
+          <w:p>
+            <w:r>
+              <w:rPr/>
+              <w:t xml:space="preserve">118.33</w:t>
+            </w:r>
+          </w:p>
+        </w:tc>
+        <w:tc>
+          <w:tcPr>
+            <w:tcW w:w="1800" w:type="dxa"/>
+          </w:tcPr>
+          <w:p>
+            <w:r>
+              <w:rPr/>
+              <w:t xml:space="preserve">20.00</w:t>
+            </w:r>
+          </w:p>
+        </w:tc>
+        <w:tc>
+          <w:tcPr>
+            <w:tcW w:w="1800" w:type="dxa"/>
+          </w:tcPr>
+          <w:p>
+            <w:r>
+              <w:rPr/>
+              <w:t xml:space="preserve">1183.26</w:t>
+            </w:r>
+          </w:p>
+        </w:tc>
+      </w:tr>
+      <w:tr>
+        <w:tc>
+          <w:tcPr>
+            <w:tcW w:w="1800" w:type="dxa"/>
+          </w:tcPr>
+          <w:p>
+            <w:r>
+              <w:rPr/>
+              <w:t xml:space="preserve">MILP Rolling</w:t>
+            </w:r>
+          </w:p>
+        </w:tc>
+        <w:tc>
+          <w:tcPr>
+            <w:tcW w:w="1800" w:type="dxa"/>
+          </w:tcPr>
+          <w:p>
+            <w:r>
+              <w:rPr/>
+              <w:t xml:space="preserve">4.722</w:t>
+            </w:r>
+          </w:p>
+        </w:tc>
+        <w:tc>
+          <w:tcPr>
+            <w:tcW w:w="1800" w:type="dxa"/>
+          </w:tcPr>
+          <w:p>
+            <w:r>
+              <w:rPr/>
+              <w:t xml:space="preserve">0.836</w:t>
+            </w:r>
+          </w:p>
+        </w:tc>
+        <w:tc>
+          <w:tcPr>
+            <w:tcW w:w="1800" w:type="dxa"/>
+          </w:tcPr>
+          <w:p>
+            <w:r>
+              <w:rPr/>
+              <w:t xml:space="preserve">0.911</w:t>
+            </w:r>
+          </w:p>
+        </w:tc>
+        <w:tc>
+          <w:tcPr>
+            <w:tcW w:w="1800" w:type="dxa"/>
+          </w:tcPr>
+          <w:p>
+            <w:r>
+              <w:rPr/>
+              <w:t xml:space="preserve">118.00</w:t>
+            </w:r>
+          </w:p>
+        </w:tc>
+        <w:tc>
+          <w:tcPr>
+            <w:tcW w:w="1800" w:type="dxa"/>
+          </w:tcPr>
+          <w:p>
+            <w:r>
+              <w:rPr/>
+              <w:t xml:space="preserve">23.00</w:t>
+            </w:r>
+          </w:p>
+        </w:tc>
+        <w:tc>
+          <w:tcPr>
+            <w:tcW w:w="1800" w:type="dxa"/>
+          </w:tcPr>
+          <w:p>
+            <w:r>
+              <w:rPr/>
+              <w:t xml:space="preserve">1173.00</w:t>
+            </w:r>
+          </w:p>
+        </w:tc>
+      </w:tr>
+      <w:tr>
+        <w:tc>
+          <w:tcPr>
+            <w:tcW w:w="1800" w:type="dxa"/>
+          </w:tcPr>
+          <w:p>
+            <w:r>
+              <w:rPr/>
+              <w:t xml:space="preserve">Vanilla A2C</w:t>
+            </w:r>
+          </w:p>
+        </w:tc>
+        <w:tc>
+          <w:tcPr>
+            <w:tcW w:w="1800" w:type="dxa"/>
+          </w:tcPr>
+          <w:p>
+            <w:r>
+              <w:rPr/>
+              <w:t xml:space="preserve">24.371</w:t>
+            </w:r>
+          </w:p>
+        </w:tc>
+        <w:tc>
+          <w:tcPr>
+            <w:tcW w:w="1800" w:type="dxa"/>
+          </w:tcPr>
+          <w:p>
+            <w:r>
+              <w:rPr/>
+              <w:t xml:space="preserve">0.618</w:t>
+            </w:r>
+          </w:p>
+        </w:tc>
+        <w:tc>
+          <w:tcPr>
+            <w:tcW w:w="1800" w:type="dxa"/>
+          </w:tcPr>
+          <w:p>
+            <w:r>
+              <w:rPr/>
+              <w:t xml:space="preserve">0.948</w:t>
+            </w:r>
+          </w:p>
+        </w:tc>
+        <w:tc>
+          <w:tcPr>
+            <w:tcW w:w="1800" w:type="dxa"/>
+          </w:tcPr>
+          <w:p>
+            <w:r>
+              <w:rPr/>
+              <w:t xml:space="preserve">27.67</w:t>
+            </w:r>
+          </w:p>
+        </w:tc>
+        <w:tc>
+          <w:tcPr>
+            <w:tcW w:w="1800" w:type="dxa"/>
+          </w:tcPr>
+          <w:p>
+            <w:r>
+              <w:rPr/>
+              <w:t xml:space="preserve">17.67</w:t>
+            </w:r>
+          </w:p>
+        </w:tc>
+        <w:tc>
+          <w:tcPr>
+            <w:tcW w:w="1800" w:type="dxa"/>
+          </w:tcPr>
+          <w:p>
+            <w:r>
+              <w:rPr/>
+              <w:t xml:space="preserve">-267.35</w:t>
+            </w:r>
+          </w:p>
+        </w:tc>
+      </w:tr>
+      <w:tr>
+        <w:tc>
+          <w:tcPr>
+            <w:tcW w:w="1800" w:type="dxa"/>
+          </w:tcPr>
+          <w:p>
+            <w:r>
+              <w:rPr/>
+              <w:t xml:space="preserve">Behavior Cloning</w:t>
+            </w:r>
+          </w:p>
+        </w:tc>
+        <w:tc>
+          <w:tcPr>
+            <w:tcW w:w="1800" w:type="dxa"/>
+          </w:tcPr>
+          <w:p>
+            <w:r>
+              <w:rPr/>
+              <w:t xml:space="preserve">30.031</w:t>
+            </w:r>
+          </w:p>
+        </w:tc>
+        <w:tc>
+          <w:tcPr>
+            <w:tcW w:w="1800" w:type="dxa"/>
+          </w:tcPr>
+          <w:p>
+            <w:r>
+              <w:rPr/>
+              <w:t xml:space="preserve">0.453</w:t>
+            </w:r>
+          </w:p>
+        </w:tc>
+        <w:tc>
+          <w:tcPr>
+            <w:tcW w:w="1800" w:type="dxa"/>
+          </w:tcPr>
+          <w:p>
+            <w:r>
+              <w:rPr/>
+              <w:t xml:space="preserve">0.937</w:t>
+            </w:r>
+          </w:p>
+        </w:tc>
+        <w:tc>
+          <w:tcPr>
+            <w:tcW w:w="1800" w:type="dxa"/>
+          </w:tcPr>
+          <w:p>
+            <w:r>
+              <w:rPr/>
+              <w:t xml:space="preserve">62.67</w:t>
+            </w:r>
+          </w:p>
+        </w:tc>
+        <w:tc>
+          <w:tcPr>
+            <w:tcW w:w="1800" w:type="dxa"/>
+          </w:tcPr>
+          <w:p>
+            <w:r>
+              <w:rPr/>
+              <w:t xml:space="preserve">73.33</w:t>
+            </w:r>
+          </w:p>
+        </w:tc>
+        <w:tc>
+          <w:tcPr>
+            <w:tcW w:w="1800" w:type="dxa"/>
+          </w:tcPr>
+          <w:p>
+            <w:r>
+              <w:rPr/>
+              <w:t xml:space="preserve">-446.05</w:t>
+            </w:r>
+          </w:p>
+        </w:tc>
+      </w:tr>
+      <w:tr>
+        <w:tc>
+          <w:tcPr>
+            <w:tcW w:w="1800" w:type="dxa"/>
+          </w:tcPr>
+          <w:p>
+            <w:r>
+              <w:rPr/>
+              <w:t xml:space="preserve">BC Warm-Start + A2C</w:t>
+            </w:r>
+          </w:p>
+        </w:tc>
+        <w:tc>
+          <w:tcPr>
+            <w:tcW w:w="1800" w:type="dxa"/>
+          </w:tcPr>
+          <w:p>
+            <w:r>
+              <w:rPr/>
+              <w:t xml:space="preserve">26.713</w:t>
+            </w:r>
+          </w:p>
+        </w:tc>
+        <w:tc>
+          <w:tcPr>
+            <w:tcW w:w="1800" w:type="dxa"/>
+          </w:tcPr>
+          <w:p>
+            <w:r>
+              <w:rPr/>
+              <w:t xml:space="preserve">0.409</w:t>
+            </w:r>
+          </w:p>
+        </w:tc>
+        <w:tc>
+          <w:tcPr>
+            <w:tcW w:w="1800" w:type="dxa"/>
+          </w:tcPr>
+          <w:p>
+            <w:r>
+              <w:rPr/>
+              <w:t xml:space="preserve">0.807</w:t>
+            </w:r>
+          </w:p>
+        </w:tc>
+        <w:tc>
+          <w:tcPr>
+            <w:tcW w:w="1800" w:type="dxa"/>
+          </w:tcPr>
+          <w:p>
+            <w:r>
+              <w:rPr/>
+              <w:t xml:space="preserve">55.33</w:t>
+            </w:r>
+          </w:p>
+        </w:tc>
+        <w:tc>
+          <w:tcPr>
+            <w:tcW w:w="1800" w:type="dxa"/>
+          </w:tcPr>
+          <w:p>
+            <w:r>
+              <w:rPr/>
+              <w:t xml:space="preserve">80.00</w:t>
+            </w:r>
+          </w:p>
+        </w:tc>
+        <w:tc>
+          <w:tcPr>
+            <w:tcW w:w="1800" w:type="dxa"/>
+          </w:tcPr>
+          <w:p>
+            <w:r>
+              <w:rPr/>
+              <w:t xml:space="preserve">-700.71</w:t>
+            </w:r>
+          </w:p>
+        </w:tc>
+      </w:tr>
+      <w:tr>
+        <w:tc>
+          <w:tcPr>
+            <w:tcW w:w="1800" w:type="dxa"/>
+          </w:tcPr>
+          <w:p>
+            <w:r>
+              <w:rPr/>
+              <w:t xml:space="preserve">A2C without Advantage Normalization</w:t>
+            </w:r>
+          </w:p>
+        </w:tc>
+        <w:tc>
+          <w:tcPr>
+            <w:tcW w:w="1800" w:type="dxa"/>
+          </w:tcPr>
+          <w:p>
+            <w:r>
+              <w:rPr/>
+              <w:t xml:space="preserve">35.832</w:t>
+            </w:r>
+          </w:p>
+        </w:tc>
+        <w:tc>
+          <w:tcPr>
+            <w:tcW w:w="1800" w:type="dxa"/>
+          </w:tcPr>
+          <w:p>
+            <w:r>
+              <w:rPr/>
+              <w:t xml:space="preserve">0.438</w:t>
+            </w:r>
+          </w:p>
+        </w:tc>
+        <w:tc>
+          <w:tcPr>
+            <w:tcW w:w="1800" w:type="dxa"/>
+          </w:tcPr>
+          <w:p>
+            <w:r>
+              <w:rPr/>
+              <w:t xml:space="preserve">0.948</w:t>
+            </w:r>
+          </w:p>
+        </w:tc>
+        <w:tc>
+          <w:tcPr>
+            <w:tcW w:w="1800" w:type="dxa"/>
+          </w:tcPr>
+          <w:p>
+            <w:r>
+              <w:rPr/>
+              <w:t xml:space="preserve">25.00</w:t>
+            </w:r>
+          </w:p>
+        </w:tc>
+        <w:tc>
+          <w:tcPr>
+            <w:tcW w:w="1800" w:type="dxa"/>
+          </w:tcPr>
+          <w:p>
+            <w:r>
+              <w:rPr/>
+              <w:t xml:space="preserve">32.33</w:t>
+            </w:r>
+          </w:p>
+        </w:tc>
+        <w:tc>
+          <w:tcPr>
+            <w:tcW w:w="1800" w:type="dxa"/>
+          </w:tcPr>
+          <w:p>
+            <w:r>
+              <w:rPr/>
+              <w:t xml:space="preserve">-527.42</w:t>
+            </w:r>
+          </w:p>
+        </w:tc>
+      </w:tr>
+    </w:tbl>
+    <w:p>
+      <w:r>
+        <w:rPr/>
+        <w:t xml:space="preserve"/>
+      </w:r>
+    </w:p>
+    <w:p>
+      <w:r>
+        <w:rPr/>
+        <w:t xml:space="preserve">The vanilla A2C model was trained for 50,000 steps. The training and evaluation pipeline worked correctly. The model interacted with the environment, used the action mask, saved weights, and produced evaluation metrics. However, the final performance was not competitive. The vanilla A2C model achieved a cost per order of 24.371, which was worse than both Random Policy and Greedy Nearest.</w:t>
+      </w:r>
+    </w:p>
+    <w:p>
+      <w:r>
+        <w:rPr/>
+        <w:t xml:space="preserve">This result shows that learning a good dispatching policy from scratch is difficult in this environment. The action space is large, the rewards are delayed, and the agent must learn order assignment, battery management, charging behavior, and delivery deadlines at the same time. On the other hand, Greedy Nearest is already a strong hand-designed rule for this problem.</w:t>
+      </w:r>
+    </w:p>
+    <w:p>
+      <w:r>
+        <w:rPr/>
+        <w:t xml:space="preserve">The behavior cloning model also could not reach the performance of Greedy Nearest. Although it imitated some expert actions, its accuracy was not high enough. Small mistakes in action selection caused many dropped orders. The BC warm-start + A2C fine-tuning experiment improved the direct behavior cloning cost from 30.031 to 26.713, but it was still not better than vanilla A2C.</w:t>
+      </w:r>
+    </w:p>
+    <w:p>
+      <w:r>
+        <w:rPr/>
+        <w:t xml:space="preserve">In conclusion, the Role B models were successfully integrated into the simulator and evaluated with saved logs and weights. The learned policies did not pass the Greedy Nearest baseline. However, the experiments clearly showed why policy-gradient learning is difficult in this dispatching environment. The results also showed that advantage normalization is useful for stabilizing A2C, while behavior cloning warm-start needs stronger imitation accuracy to become effective.</w:t>
+      </w:r>
+    </w:p>
     <w:sectPr>
       <w:pgSz w:w="11906" w:h="16838"/>
       <w:pgMar w:top="1417" w:right="1417" w:bottom="1417" w:left="1417" w:header="708" w:footer="708" w:gutter="0"/>
@@ -11579,371 +12438,6 @@
     <w:p>
       <w:r>
         <w:br w:type="page"/>
-      </w:r>
-    </w:p>
-    <w:p>
-      <w:r>
-        <w:t xml:space="preserve">3. ROLE B- POLICY BASED METHODS</w:t>
-      </w:r>
-    </w:p>
-    <w:p>
-      <w:r>
-        <w:t xml:space="preserve"/>
-      </w:r>
-    </w:p>
-    <w:p>
-      <w:r>
-        <w:t xml:space="preserve">In this section, policy-based reinforcement learning and actor-critic methods are developed and tested on the DroneDispatch-v0 environment. The main method used in this role is Advantage Actor-Critic (A2C). In addition to the standard A2C implementation, behavior cloning from the Greedy Nearest policy and a behavior cloning warm-start experiment were also tested. Finally, an ablation study was performed by removing advantage normalization.</w:t>
-      </w:r>
-    </w:p>
-    <w:p>
-      <w:r>
-        <w:t xml:space="preserve"/>
-      </w:r>
-    </w:p>
-    <w:p>
-      <w:r>
-        <w:t xml:space="preserve">3.1 Environment Structure</w:t>
-      </w:r>
-    </w:p>
-    <w:p>
-      <w:r>
-        <w:t xml:space="preserve"/>
-      </w:r>
-    </w:p>
-    <w:p>
-      <w:r>
-        <w:t xml:space="preserve">For Role B, the same DroneDispatch-v0 environment was used. The environment has 8 drones and a maximum visible order window of 20 orders. The action space has 169 discrete actions in total. These actions include assigning a drone to an order, sending an idle drone to a charger, or choosing a no-op action.</w:t>
-      </w:r>
-    </w:p>
-    <w:p>
-      <w:r>
-        <w:t xml:space="preserve"/>
-      </w:r>
-    </w:p>
-    <w:p>
-      <w:r>
-        <w:t xml:space="preserve">The observation space is given as a dictionary. In our implementation, the drone vector, order vector, and time variable were flattened and combined into a single 181-dimensional state vector. The grid layout was not included in the first model in order to keep the policy network simple. Also, the action mask was used during training and evaluation. This prevented the policy from selecting invalid actions.</w:t>
-      </w:r>
-    </w:p>
-    <w:p>
-      <w:r>
-        <w:t xml:space="preserve"/>
-      </w:r>
-    </w:p>
-    <w:p>
-      <w:r>
-        <w:t xml:space="preserve">3.2 A2C Implementation</w:t>
-      </w:r>
-    </w:p>
-    <w:p>
-      <w:r>
-        <w:t xml:space="preserve"/>
-      </w:r>
-    </w:p>
-    <w:p>
-      <w:r>
-        <w:t xml:space="preserve">The main policy-based model was implemented using an Actor-Critic network. The network has a shared multilayer structure and two separate output heads. The actor head produces action logits for the 169 discrete actions. The critic head estimates the state value.</w:t>
-      </w:r>
-    </w:p>
-    <w:p>
-      <w:r>
-        <w:t xml:space="preserve"/>
-      </w:r>
-    </w:p>
-    <w:p>
-      <w:r>
-        <w:t xml:space="preserve">During training, the agent collects rollout steps from the environment. Then, Generalized Advantage Estimation (GAE) is used to calculate the advantage values. These advantage values are used in the policy loss. The critic is trained with mean squared error between the predicted value and the return target. An entropy term is also added to encourage exploration.</w:t>
-      </w:r>
-    </w:p>
-    <w:p>
-      <w:r>
-        <w:t xml:space="preserve"/>
-      </w:r>
-    </w:p>
-    <w:p>
-      <w:r>
-        <w:t xml:space="preserve">The total loss consists of three parts: Policy loss + Value loss - Entropy bonus.</w:t>
-      </w:r>
-    </w:p>
-    <w:p>
-      <w:r>
-        <w:t xml:space="preserve"/>
-      </w:r>
-    </w:p>
-    <w:p>
-      <w:r>
-        <w:t xml:space="preserve">In the main A2C experiment, advantage normalization was used to make the learning process more stable. Because of package installation problems on the local computer, a small manual Adam optimizer was implemented instead of using torch.optim.Adam. This did not change the learning logic, but it made the code runnable in the available environment.</w:t>
-      </w:r>
-    </w:p>
-    <w:p>
-      <w:r>
-        <w:t xml:space="preserve"/>
-      </w:r>
-    </w:p>
-    <w:p>
-      <w:r>
-        <w:t xml:space="preserve">3.3 Experimental Setup</w:t>
-      </w:r>
-    </w:p>
-    <w:p>
-      <w:r>
-        <w:t xml:space="preserve"/>
-      </w:r>
-    </w:p>
-    <w:p>
-      <w:r>
-        <w:t xml:space="preserve">All Role B experiments were run with the standard evaluation configuration and seeds 0, 1, and 2. The model parameters were stored in YAML configuration files. At the end of each training, model weights (.pt), logs (.csv), and evaluation results (.json) were saved.</w:t>
-      </w:r>
-    </w:p>
-    <w:p>
-      <w:r>
-        <w:t xml:space="preserve"/>
-      </w:r>
-    </w:p>
-    <w:p>
-      <w:r>
-        <w:t xml:space="preserve">The following methods were tested:</w:t>
-      </w:r>
-    </w:p>
-    <w:p>
-      <w:r>
-        <w:t xml:space="preserve">- Vanilla A2C</w:t>
-      </w:r>
-    </w:p>
-    <w:p>
-      <w:r>
-        <w:t xml:space="preserve">- Behavior Cloning from Greedy Nearest</w:t>
-      </w:r>
-    </w:p>
-    <w:p>
-      <w:r>
-        <w:t xml:space="preserve">- Behavior Cloning Warm-Start + A2C Fine-Tuning</w:t>
-      </w:r>
-    </w:p>
-    <w:p>
-      <w:r>
-        <w:t xml:space="preserve">- A2C without Advantage Normalization</w:t>
-      </w:r>
-    </w:p>
-    <w:p>
-      <w:r>
-        <w:t xml:space="preserve"/>
-      </w:r>
-    </w:p>
-    <w:p>
-      <w:r>
-        <w:t xml:space="preserve">The baseline methods used for comparison were Random Policy, Greedy Nearest, and MILP Rolling.</w:t>
-      </w:r>
-    </w:p>
-    <w:p>
-      <w:r>
-        <w:t xml:space="preserve"/>
-      </w:r>
-    </w:p>
-    <w:p>
-      <w:r>
-        <w:t xml:space="preserve">The baseline results are as follows:</w:t>
-      </w:r>
-    </w:p>
-    <w:p>
-      <w:r>
-        <w:t xml:space="preserve">- Random Policy Cost per Order: 18.780</w:t>
-      </w:r>
-    </w:p>
-    <w:p>
-      <w:r>
-        <w:t xml:space="preserve">- Greedy Nearest Cost per Order: 4.570</w:t>
-      </w:r>
-    </w:p>
-    <w:p>
-      <w:r>
-        <w:t xml:space="preserve">- MILP Rolling Cost per Order: 4.722</w:t>
-      </w:r>
-    </w:p>
-    <w:p>
-      <w:r>
-        <w:t xml:space="preserve"/>
-      </w:r>
-    </w:p>
-    <w:p>
-      <w:r>
-        <w:t xml:space="preserve">According to the main metric, Greedy Nearest was the strongest baseline. Therefore, it was used as the main comparison point for Role B.</w:t>
-      </w:r>
-    </w:p>
-    <w:p>
-      <w:r>
-        <w:t xml:space="preserve"/>
-      </w:r>
-    </w:p>
-    <w:p>
-      <w:r>
-        <w:t xml:space="preserve">3.4 Behavior Cloning Warm-Start</w:t>
-      </w:r>
-    </w:p>
-    <w:p>
-      <w:r>
-        <w:t xml:space="preserve"/>
-      </w:r>
-    </w:p>
-    <w:p>
-      <w:r>
-        <w:t xml:space="preserve">After the vanilla A2C experiment, behavior cloning was tested as a warm-start method. In this method, the actor network was first trained to imitate the Greedy Nearest policy. The idea was to start the policy from a more meaningful dispatching behavior instead of a random policy.</w:t>
-      </w:r>
-    </w:p>
-    <w:p>
-      <w:r>
-        <w:t xml:space="preserve"/>
-      </w:r>
-    </w:p>
-    <w:p>
-      <w:r>
-        <w:t xml:space="preserve">The behavior cloning model was trained using expert state-action pairs collected from the Greedy Nearest policy. After 8 epochs, the imitation accuracy reached approximately 0.337. This means that the model learned some expert-like behavior, but it could not reliably copy the Greedy Nearest policy.</w:t>
-      </w:r>
-    </w:p>
-    <w:p>
-      <w:r>
-        <w:t xml:space="preserve"/>
-      </w:r>
-    </w:p>
-    <w:p>
-      <w:r>
-        <w:t xml:space="preserve">Then, this behavior cloning model was used as the initial model for A2C fine-tuning. The aim was to improve the cloned policy with reinforcement learning.</w:t>
-      </w:r>
-    </w:p>
-    <w:p>
-      <w:r>
-        <w:t xml:space="preserve"/>
-      </w:r>
-    </w:p>
-    <w:p>
-      <w:r>
-        <w:t xml:space="preserve">3.5 Ablation Study</w:t>
-      </w:r>
-    </w:p>
-    <w:p>
-      <w:r>
-        <w:t xml:space="preserve"/>
-      </w:r>
-    </w:p>
-    <w:p>
-      <w:r>
-        <w:t xml:space="preserve">For the ablation study, the effect of advantage normalization was tested. In the main A2C model, advantage normalization was used. In the ablation experiment, the same A2C structure was trained again, but advantage normalization was turned off.</w:t>
-      </w:r>
-    </w:p>
-    <w:p>
-      <w:r>
-        <w:t xml:space="preserve"/>
-      </w:r>
-    </w:p>
-    <w:p>
-      <w:r>
-        <w:t xml:space="preserve">This comparison showed that removing advantage normalization made the results worse. With advantage normalization, vanilla A2C achieved a cost per order of 24.371. Without advantage normalization, the cost per order increased to 35.832. Therefore, advantage normalization helped stabilize the A2C training, even though it was not enough to reach the Greedy Nearest baseline.</w:t>
-      </w:r>
-    </w:p>
-    <w:p>
-      <w:r>
-        <w:t xml:space="preserve"/>
-      </w:r>
-    </w:p>
-    <w:p>
-      <w:r>
-        <w:t xml:space="preserve">3.6 Results and Evaluation</w:t>
-      </w:r>
-    </w:p>
-    <w:p>
-      <w:r>
-        <w:t xml:space="preserve"/>
-      </w:r>
-    </w:p>
-    <w:p>
-      <w:r>
-        <w:t xml:space="preserve">The Role B results are summarized below.</w:t>
-      </w:r>
-    </w:p>
-    <w:p>
-      <w:r>
-        <w:t xml:space="preserve"/>
-      </w:r>
-    </w:p>
-    <w:p>
-      <w:r>
-        <w:t xml:space="preserve">Method | Cost per Order | Success Rate | On-Time Rate | Delivered Orders | Dropped Orders | Episode Return</w:t>
-      </w:r>
-    </w:p>
-    <w:p>
-      <w:r>
-        <w:t xml:space="preserve">Random Policy | 18.780 | 0.653 | 0.890 | 39.67 | 21.67 | -168.33</w:t>
-      </w:r>
-    </w:p>
-    <w:p>
-      <w:r>
-        <w:t xml:space="preserve">Greedy Nearest | 4.570 | 0.855 | 0.903 | 118.33 | 20.00 | 1183.26</w:t>
-      </w:r>
-    </w:p>
-    <w:p>
-      <w:r>
-        <w:t xml:space="preserve">MILP Rolling | 4.722 | 0.836 | 0.911 | 118.00 | 23.00 | 1173.00</w:t>
-      </w:r>
-    </w:p>
-    <w:p>
-      <w:r>
-        <w:t xml:space="preserve">Vanilla A2C | 24.371 | 0.618 | 0.948 | 27.67 | 17.67 | -267.35</w:t>
-      </w:r>
-    </w:p>
-    <w:p>
-      <w:r>
-        <w:t xml:space="preserve">Behavior Cloning | 30.031 | 0.453 | 0.937 | 62.67 | 73.33 | -446.05</w:t>
-      </w:r>
-    </w:p>
-    <w:p>
-      <w:r>
-        <w:t xml:space="preserve">BC Warm-Start + A2C | 26.713 | 0.409 | 0.807 | 55.33 | 80.00 | -700.71</w:t>
-      </w:r>
-    </w:p>
-    <w:p>
-      <w:r>
-        <w:t xml:space="preserve">A2C without Advantage Normalization | 35.832 | 0.438 | 0.948 | 25.00 | 32.33 | -527.42</w:t>
-      </w:r>
-    </w:p>
-    <w:p>
-      <w:r>
-        <w:t xml:space="preserve"/>
-      </w:r>
-    </w:p>
-    <w:p>
-      <w:r>
-        <w:t xml:space="preserve">The vanilla A2C model was trained for 50,000 steps. The training and evaluation pipeline worked correctly. The model interacted with the environment, used the action mask, saved weights, and produced evaluation metrics. However, the final performance was not competitive. The vanilla A2C model achieved a cost per order of 24.371, which was worse than both Random Policy and Greedy Nearest.</w:t>
-      </w:r>
-    </w:p>
-    <w:p>
-      <w:r>
-        <w:t xml:space="preserve"/>
-      </w:r>
-    </w:p>
-    <w:p>
-      <w:r>
-        <w:t xml:space="preserve">This result shows that learning a good dispatching policy from scratch is difficult in this environment. The action space is large, the rewards are delayed, and the agent must learn order assignment, battery management, charging behavior, and delivery deadlines at the same time. On the other hand, Greedy Nearest is already a strong hand-designed rule for this problem.</w:t>
-      </w:r>
-    </w:p>
-    <w:p>
-      <w:r>
-        <w:t xml:space="preserve"/>
-      </w:r>
-    </w:p>
-    <w:p>
-      <w:r>
-        <w:t xml:space="preserve">The behavior cloning model also could not reach the performance of Greedy Nearest. Although it imitated some expert actions, its accuracy was not high enough. Small mistakes in action selection caused many dropped orders. The BC warm-start + A2C fine-tuning experiment improved the direct behavior cloning cost from 30.031 to 26.713, but it was still not better than vanilla A2C.</w:t>
-      </w:r>
-    </w:p>
-    <w:p>
-      <w:r>
-        <w:t xml:space="preserve"/>
-      </w:r>
-    </w:p>
-    <w:p>
-      <w:r>
-        <w:t xml:space="preserve">In conclusion, the Role B models were successfully integrated into the simulator and evaluated with saved logs and weights. The learned policies did not pass the Greedy Nearest baseline. However, the experiments clearly showed why policy-gradient learning is difficult in this dispatching environment. The results also showed that advantage normalization is useful for stabilizing A2C, while behavior cloning warm-start needs stronger imitation accuracy to become effective.</w:t>
       </w:r>
     </w:p>
   </w:body>

</xml_diff>

<commit_message>
update role b section and visuals in team report
</commit_message>
<xml_diff>
--- a/Team_Report.docx
+++ b/Team_Report.docx
@@ -1,6 +1,6 @@
 
 <file path=word/document.xml><?xml version="1.0" encoding="utf-8"?>
-<w:document xmlns:wpc="http://schemas.microsoft.com/office/word/2010/wordprocessingCanvas" xmlns:cx="http://schemas.microsoft.com/office/drawing/2014/chartex" xmlns:cx1="http://schemas.microsoft.com/office/drawing/2015/9/8/chartex" xmlns:cx2="http://schemas.microsoft.com/office/drawing/2015/10/21/chartex" xmlns:cx3="http://schemas.microsoft.com/office/drawing/2016/5/9/chartex" xmlns:cx4="http://schemas.microsoft.com/office/drawing/2016/5/10/chartex" xmlns:cx5="http://schemas.microsoft.com/office/drawing/2016/5/11/chartex" xmlns:cx6="http://schemas.microsoft.com/office/drawing/2016/5/12/chartex" xmlns:cx7="http://schemas.microsoft.com/office/drawing/2016/5/13/chartex" xmlns:cx8="http://schemas.microsoft.com/office/drawing/2016/5/14/chartex" xmlns:mc="http://schemas.openxmlformats.org/markup-compatibility/2006" xmlns:aink="http://schemas.microsoft.com/office/drawing/2016/ink" xmlns:am3d="http://schemas.microsoft.com/office/drawing/2017/model3d" xmlns:o="urn:schemas-microsoft-com:office:office" xmlns:oel="http://schemas.microsoft.com/office/2019/extlst" xmlns:r="http://schemas.openxmlformats.org/officeDocument/2006/relationships" xmlns:m="http://schemas.openxmlformats.org/officeDocument/2006/math" xmlns:v="urn:schemas-microsoft-com:vml" xmlns:wp14="http://schemas.microsoft.com/office/word/2010/wordprocessingDrawing" xmlns:wp="http://schemas.openxmlformats.org/drawingml/2006/wordprocessingDrawing" xmlns:w10="urn:schemas-microsoft-com:office:word" xmlns:w="http://schemas.openxmlformats.org/wordprocessingml/2006/main" xmlns:w14="http://schemas.microsoft.com/office/word/2010/wordml" xmlns:w15="http://schemas.microsoft.com/office/word/2012/wordml" xmlns:w16cex="http://schemas.microsoft.com/office/word/2018/wordml/cex" xmlns:w16cid="http://schemas.microsoft.com/office/word/2016/wordml/cid" xmlns:w16="http://schemas.microsoft.com/office/word/2018/wordml" xmlns:w16du="http://schemas.microsoft.com/office/word/2023/wordml/word16du" xmlns:w16sdtdh="http://schemas.microsoft.com/office/word/2020/wordml/sdtdatahash" xmlns:w16sdtfl="http://schemas.microsoft.com/office/word/2024/wordml/sdtformatlock" xmlns:w16se="http://schemas.microsoft.com/office/word/2015/wordml/symex" xmlns:wpg="http://schemas.microsoft.com/office/word/2010/wordprocessingGroup" xmlns:wpi="http://schemas.microsoft.com/office/word/2010/wordprocessingInk" xmlns:wne="http://schemas.microsoft.com/office/word/2006/wordml" xmlns:wps="http://schemas.microsoft.com/office/word/2010/wordprocessingShape" mc:Ignorable="w14 w15 w16se w16cid w16 w16cex w16sdtdh w16sdtfl w16du wp14">
+<w:document xmlns:wpc="http://schemas.microsoft.com/office/word/2010/wordprocessingCanvas" xmlns:cx="http://schemas.microsoft.com/office/drawing/2014/chartex" xmlns:cx1="http://schemas.microsoft.com/office/drawing/2015/9/8/chartex" xmlns:cx2="http://schemas.microsoft.com/office/drawing/2015/10/21/chartex" xmlns:cx3="http://schemas.microsoft.com/office/drawing/2016/5/9/chartex" xmlns:cx4="http://schemas.microsoft.com/office/drawing/2016/5/10/chartex" xmlns:cx5="http://schemas.microsoft.com/office/drawing/2016/5/11/chartex" xmlns:cx6="http://schemas.microsoft.com/office/drawing/2016/5/12/chartex" xmlns:cx7="http://schemas.microsoft.com/office/drawing/2016/5/13/chartex" xmlns:cx8="http://schemas.microsoft.com/office/drawing/2016/5/14/chartex" xmlns:mc="http://schemas.openxmlformats.org/markup-compatibility/2006" xmlns:aink="http://schemas.microsoft.com/office/drawing/2016/ink" xmlns:am3d="http://schemas.microsoft.com/office/drawing/2017/model3d" xmlns:o="urn:schemas-microsoft-com:office:office" xmlns:oel="http://schemas.microsoft.com/office/2019/extlst" xmlns:r="http://schemas.openxmlformats.org/officeDocument/2006/relationships" xmlns:m="http://schemas.openxmlformats.org/officeDocument/2006/math" xmlns:v="urn:schemas-microsoft-com:vml" xmlns:wp14="http://schemas.microsoft.com/office/word/2010/wordprocessingDrawing" xmlns:wp="http://schemas.openxmlformats.org/drawingml/2006/wordprocessingDrawing" xmlns:w10="urn:schemas-microsoft-com:office:word" xmlns:w="http://schemas.openxmlformats.org/wordprocessingml/2006/main" xmlns:w14="http://schemas.microsoft.com/office/word/2010/wordml" xmlns:w15="http://schemas.microsoft.com/office/word/2012/wordml" xmlns:w16cex="http://schemas.microsoft.com/office/word/2018/wordml/cex" xmlns:w16cid="http://schemas.microsoft.com/office/word/2016/wordml/cid" xmlns:w16="http://schemas.microsoft.com/office/word/2018/wordml" xmlns:w16du="http://schemas.microsoft.com/office/word/2023/wordml/word16du" xmlns:w16sdtdh="http://schemas.microsoft.com/office/word/2020/wordml/sdtdatahash" xmlns:w16sdtfl="http://schemas.microsoft.com/office/word/2024/wordml/sdtformatlock" xmlns:w16se="http://schemas.microsoft.com/office/word/2015/wordml/symex" xmlns:wpg="http://schemas.microsoft.com/office/word/2010/wordprocessingGroup" xmlns:wpi="http://schemas.microsoft.com/office/word/2010/wordprocessingInk" xmlns:wne="http://schemas.microsoft.com/office/word/2006/wordml" xmlns:wps="http://schemas.microsoft.com/office/word/2010/wordprocessingShape" xmlns:a="http://schemas.openxmlformats.org/drawingml/2006/main" xmlns:pic="http://schemas.openxmlformats.org/drawingml/2006/picture" xmlns:a14="http://schemas.microsoft.com/office/drawing/2010/main" mc:Ignorable="w14 w15 w16se w16cid w16 w16cex w16sdtdh w16sdtfl w16du wp14">
   <w:body>
     <w:p>
       <w:pPr>
@@ -8385,12 +8385,12 @@
       <w:tblPr>
         <w:tblW w:w="0" w:type="auto"/>
         <w:tblBorders>
-          <w:top w:val="single" w:sz="4" w:space="0" w:color="000000"/>
-          <w:left w:val="single" w:sz="4" w:space="0" w:color="000000"/>
-          <w:bottom w:val="single" w:sz="4" w:space="0" w:color="000000"/>
-          <w:right w:val="single" w:sz="4" w:space="0" w:color="000000"/>
-          <w:insideH w:val="single" w:sz="4" w:space="0" w:color="000000"/>
-          <w:insideV w:val="single" w:sz="4" w:space="0" w:color="000000"/>
+          <w:top w:val="single" w:color="000000" w:sz="4" w:space="0"/>
+          <w:left w:val="single" w:color="000000" w:sz="4" w:space="0"/>
+          <w:bottom w:val="single" w:color="000000" w:sz="4" w:space="0"/>
+          <w:right w:val="single" w:color="000000" w:sz="4" w:space="0"/>
+          <w:insideH w:val="single" w:color="000000" w:sz="4" w:space="0"/>
+          <w:insideV w:val="single" w:color="000000" w:sz="4" w:space="0"/>
         </w:tblBorders>
         <w:tblLook w:val="04A0" w:firstRow="1" w:lastRow="0" w:firstColumn="1" w:lastColumn="0" w:noHBand="0" w:noVBand="1"/>
       </w:tblPr>
@@ -9020,10 +9020,1084 @@
     </w:p>
     <w:p>
       <w:r>
-        <w:t>In conclusion, the Role B models were successfully integrated into the simulator and evaluated with saved logs and weights. The learned policies did not pass the Greedy Nearest baseline. However, the experiments clearly showed why policy-gradient learning is difficult in this dispatching environment. The results also showed that advantage normalization is useful for stabilizing A2C, while behavior cloning warm-start needs stronger imitation accuracy to become effective.</w:t>
+        <w:rPr>
+          <w:lang w:val="en-US"/>
+        </w:rPr>
+        <w:t>In</w:t>
+      </w:r>
+      <w:r>
+        <w:rPr>
+          <w:lang w:val="en-US"/>
+        </w:rPr>
+        <w:t xml:space="preserve"> </w:t>
+      </w:r>
+      <w:r>
+        <w:rPr>
+          <w:lang w:val="en-US"/>
+        </w:rPr>
+        <w:t>conclusion</w:t>
+      </w:r>
+      <w:r>
+        <w:rPr>
+          <w:lang w:val="en-US"/>
+        </w:rPr>
+        <w:t xml:space="preserve">, </w:t>
+      </w:r>
+      <w:r>
+        <w:rPr>
+          <w:lang w:val="en-US"/>
+        </w:rPr>
+        <w:t>the</w:t>
+      </w:r>
+      <w:r>
+        <w:rPr>
+          <w:lang w:val="en-US"/>
+        </w:rPr>
+        <w:t xml:space="preserve"> Role B </w:t>
+      </w:r>
+      <w:r>
+        <w:rPr>
+          <w:lang w:val="en-US"/>
+        </w:rPr>
+        <w:t>models</w:t>
+      </w:r>
+      <w:r>
+        <w:rPr>
+          <w:lang w:val="en-US"/>
+        </w:rPr>
+        <w:t xml:space="preserve"> </w:t>
+      </w:r>
+      <w:r>
+        <w:rPr>
+          <w:lang w:val="en-US"/>
+        </w:rPr>
+        <w:t>were</w:t>
+      </w:r>
+      <w:r>
+        <w:rPr>
+          <w:lang w:val="en-US"/>
+        </w:rPr>
+        <w:t xml:space="preserve"> </w:t>
+      </w:r>
+      <w:r>
+        <w:rPr>
+          <w:lang w:val="en-US"/>
+        </w:rPr>
+        <w:t>successfully</w:t>
+      </w:r>
+      <w:r>
+        <w:rPr>
+          <w:lang w:val="en-US"/>
+        </w:rPr>
+        <w:t xml:space="preserve"> </w:t>
+      </w:r>
+      <w:r>
+        <w:rPr>
+          <w:lang w:val="en-US"/>
+        </w:rPr>
+        <w:t>integrated</w:t>
+      </w:r>
+      <w:r>
+        <w:rPr>
+          <w:lang w:val="en-US"/>
+        </w:rPr>
+        <w:t xml:space="preserve"> </w:t>
+      </w:r>
+      <w:r>
+        <w:rPr>
+          <w:lang w:val="en-US"/>
+        </w:rPr>
+        <w:t>into</w:t>
+      </w:r>
+      <w:r>
+        <w:rPr>
+          <w:lang w:val="en-US"/>
+        </w:rPr>
+        <w:t xml:space="preserve"> </w:t>
+      </w:r>
+      <w:r>
+        <w:rPr>
+          <w:lang w:val="en-US"/>
+        </w:rPr>
+        <w:t>the</w:t>
+      </w:r>
+      <w:r>
+        <w:rPr>
+          <w:lang w:val="en-US"/>
+        </w:rPr>
+        <w:t xml:space="preserve"> </w:t>
+      </w:r>
+      <w:r>
+        <w:rPr>
+          <w:lang w:val="en-US"/>
+        </w:rPr>
+        <w:t>simulator</w:t>
+      </w:r>
+      <w:r>
+        <w:rPr>
+          <w:lang w:val="en-US"/>
+        </w:rPr>
+        <w:t xml:space="preserve"> </w:t>
+      </w:r>
+      <w:r>
+        <w:rPr>
+          <w:lang w:val="en-US"/>
+        </w:rPr>
+        <w:t>and</w:t>
+      </w:r>
+      <w:r>
+        <w:rPr>
+          <w:lang w:val="en-US"/>
+        </w:rPr>
+        <w:t xml:space="preserve"> </w:t>
+      </w:r>
+      <w:r>
+        <w:rPr>
+          <w:lang w:val="en-US"/>
+        </w:rPr>
+        <w:t>evaluated</w:t>
+      </w:r>
+      <w:r>
+        <w:rPr>
+          <w:lang w:val="en-US"/>
+        </w:rPr>
+        <w:t xml:space="preserve"> </w:t>
+      </w:r>
+      <w:r>
+        <w:rPr>
+          <w:lang w:val="en-US"/>
+        </w:rPr>
+        <w:t>with</w:t>
+      </w:r>
+      <w:r>
+        <w:rPr>
+          <w:lang w:val="en-US"/>
+        </w:rPr>
+        <w:t xml:space="preserve"> </w:t>
+      </w:r>
+      <w:r>
+        <w:rPr>
+          <w:lang w:val="en-US"/>
+        </w:rPr>
+        <w:t>saved</w:t>
+      </w:r>
+      <w:r>
+        <w:rPr>
+          <w:lang w:val="en-US"/>
+        </w:rPr>
+        <w:t xml:space="preserve"> </w:t>
+      </w:r>
+      <w:r>
+        <w:rPr>
+          <w:lang w:val="en-US"/>
+        </w:rPr>
+        <w:t>logs</w:t>
+      </w:r>
+      <w:r>
+        <w:rPr>
+          <w:lang w:val="en-US"/>
+        </w:rPr>
+        <w:t xml:space="preserve"> </w:t>
+      </w:r>
+      <w:r>
+        <w:rPr>
+          <w:lang w:val="en-US"/>
+        </w:rPr>
+        <w:t>and</w:t>
+      </w:r>
+      <w:r>
+        <w:rPr>
+          <w:lang w:val="en-US"/>
+        </w:rPr>
+        <w:t xml:space="preserve"> </w:t>
+      </w:r>
+      <w:r>
+        <w:rPr>
+          <w:lang w:val="en-US"/>
+        </w:rPr>
+        <w:t>weights</w:t>
+      </w:r>
+      <w:r>
+        <w:rPr>
+          <w:lang w:val="en-US"/>
+        </w:rPr>
+        <w:t xml:space="preserve">. </w:t>
+      </w:r>
+      <w:r>
+        <w:rPr>
+          <w:lang w:val="en-US"/>
+        </w:rPr>
+        <w:t>The</w:t>
+      </w:r>
+      <w:r>
+        <w:rPr>
+          <w:lang w:val="en-US"/>
+        </w:rPr>
+        <w:t xml:space="preserve"> </w:t>
+      </w:r>
+      <w:r>
+        <w:rPr>
+          <w:lang w:val="en-US"/>
+        </w:rPr>
+        <w:t>learned</w:t>
+      </w:r>
+      <w:r>
+        <w:rPr>
+          <w:lang w:val="en-US"/>
+        </w:rPr>
+        <w:t xml:space="preserve"> </w:t>
+      </w:r>
+      <w:r>
+        <w:rPr>
+          <w:lang w:val="en-US"/>
+        </w:rPr>
+        <w:t>policies</w:t>
+      </w:r>
+      <w:r>
+        <w:rPr>
+          <w:lang w:val="en-US"/>
+        </w:rPr>
+        <w:t xml:space="preserve"> </w:t>
+      </w:r>
+      <w:r>
+        <w:rPr>
+          <w:lang w:val="en-US"/>
+        </w:rPr>
+        <w:t>did</w:t>
+      </w:r>
+      <w:r>
+        <w:rPr>
+          <w:lang w:val="en-US"/>
+        </w:rPr>
+        <w:t xml:space="preserve"> not </w:t>
+      </w:r>
+      <w:r>
+        <w:rPr>
+          <w:lang w:val="en-US"/>
+        </w:rPr>
+        <w:t>pass</w:t>
+      </w:r>
+      <w:r>
+        <w:rPr>
+          <w:lang w:val="en-US"/>
+        </w:rPr>
+        <w:t xml:space="preserve"> </w:t>
+      </w:r>
+      <w:r>
+        <w:rPr>
+          <w:lang w:val="en-US"/>
+        </w:rPr>
+        <w:t>the</w:t>
+      </w:r>
+      <w:r>
+        <w:rPr>
+          <w:lang w:val="en-US"/>
+        </w:rPr>
+        <w:t xml:space="preserve"> </w:t>
+      </w:r>
+      <w:r>
+        <w:rPr>
+          <w:lang w:val="en-US"/>
+        </w:rPr>
+        <w:t>Greedy</w:t>
+      </w:r>
+      <w:r>
+        <w:rPr>
+          <w:lang w:val="en-US"/>
+        </w:rPr>
+        <w:t xml:space="preserve"> </w:t>
+      </w:r>
+      <w:r>
+        <w:rPr>
+          <w:lang w:val="en-US"/>
+        </w:rPr>
+        <w:t>Nearest</w:t>
+      </w:r>
+      <w:r>
+        <w:rPr>
+          <w:lang w:val="en-US"/>
+        </w:rPr>
+        <w:t xml:space="preserve"> </w:t>
+      </w:r>
+      <w:r>
+        <w:rPr>
+          <w:lang w:val="en-US"/>
+        </w:rPr>
+        <w:t>baseline</w:t>
+      </w:r>
+      <w:r>
+        <w:rPr>
+          <w:lang w:val="en-US"/>
+        </w:rPr>
+        <w:t xml:space="preserve">. </w:t>
+      </w:r>
+      <w:r>
+        <w:rPr>
+          <w:lang w:val="en-US"/>
+        </w:rPr>
+        <w:t>However</w:t>
+      </w:r>
+      <w:r>
+        <w:rPr>
+          <w:lang w:val="en-US"/>
+        </w:rPr>
+        <w:t xml:space="preserve">, </w:t>
+      </w:r>
+      <w:r>
+        <w:rPr>
+          <w:lang w:val="en-US"/>
+        </w:rPr>
+        <w:t>the</w:t>
+      </w:r>
+      <w:r>
+        <w:rPr>
+          <w:lang w:val="en-US"/>
+        </w:rPr>
+        <w:t xml:space="preserve"> </w:t>
+      </w:r>
+      <w:r>
+        <w:rPr>
+          <w:lang w:val="en-US"/>
+        </w:rPr>
+        <w:t>experiments</w:t>
+      </w:r>
+      <w:r>
+        <w:rPr>
+          <w:lang w:val="en-US"/>
+        </w:rPr>
+        <w:t xml:space="preserve"> </w:t>
+      </w:r>
+      <w:r>
+        <w:rPr>
+          <w:lang w:val="en-US"/>
+        </w:rPr>
+        <w:t>clearly</w:t>
+      </w:r>
+      <w:r>
+        <w:rPr>
+          <w:lang w:val="en-US"/>
+        </w:rPr>
+        <w:t xml:space="preserve"> </w:t>
+      </w:r>
+      <w:r>
+        <w:rPr>
+          <w:lang w:val="en-US"/>
+        </w:rPr>
+        <w:t>showed</w:t>
+      </w:r>
+      <w:r>
+        <w:rPr>
+          <w:lang w:val="en-US"/>
+        </w:rPr>
+        <w:t xml:space="preserve"> </w:t>
+      </w:r>
+      <w:r>
+        <w:rPr>
+          <w:lang w:val="en-US"/>
+        </w:rPr>
+        <w:t>why</w:t>
+      </w:r>
+      <w:r>
+        <w:rPr>
+          <w:lang w:val="en-US"/>
+        </w:rPr>
+        <w:t xml:space="preserve"> </w:t>
+      </w:r>
+      <w:r>
+        <w:rPr>
+          <w:lang w:val="en-US"/>
+        </w:rPr>
+        <w:t>policy-gradient</w:t>
+      </w:r>
+      <w:r>
+        <w:rPr>
+          <w:lang w:val="en-US"/>
+        </w:rPr>
+        <w:t xml:space="preserve"> </w:t>
+      </w:r>
+      <w:r>
+        <w:rPr>
+          <w:lang w:val="en-US"/>
+        </w:rPr>
+        <w:t>learning</w:t>
+      </w:r>
+      <w:r>
+        <w:rPr>
+          <w:lang w:val="en-US"/>
+        </w:rPr>
+        <w:t xml:space="preserve"> is </w:t>
+      </w:r>
+      <w:r>
+        <w:rPr>
+          <w:lang w:val="en-US"/>
+        </w:rPr>
+        <w:t>difficult</w:t>
+      </w:r>
+      <w:r>
+        <w:rPr>
+          <w:lang w:val="en-US"/>
+        </w:rPr>
+        <w:t xml:space="preserve"> in </w:t>
+      </w:r>
+      <w:r>
+        <w:rPr>
+          <w:lang w:val="en-US"/>
+        </w:rPr>
+        <w:t>this</w:t>
+      </w:r>
+      <w:r>
+        <w:rPr>
+          <w:lang w:val="en-US"/>
+        </w:rPr>
+        <w:t xml:space="preserve"> </w:t>
+      </w:r>
+      <w:r>
+        <w:rPr>
+          <w:lang w:val="en-US"/>
+        </w:rPr>
+        <w:t>dispatching</w:t>
+      </w:r>
+      <w:r>
+        <w:rPr>
+          <w:lang w:val="en-US"/>
+        </w:rPr>
+        <w:t xml:space="preserve"> </w:t>
+      </w:r>
+      <w:r>
+        <w:rPr>
+          <w:lang w:val="en-US"/>
+        </w:rPr>
+        <w:t>environment</w:t>
+      </w:r>
+      <w:r>
+        <w:rPr>
+          <w:lang w:val="en-US"/>
+        </w:rPr>
+        <w:t xml:space="preserve">. </w:t>
+      </w:r>
+      <w:r>
+        <w:rPr>
+          <w:lang w:val="en-US"/>
+        </w:rPr>
+        <w:t>The</w:t>
+      </w:r>
+      <w:r>
+        <w:rPr>
+          <w:lang w:val="en-US"/>
+        </w:rPr>
+        <w:t xml:space="preserve"> </w:t>
+      </w:r>
+      <w:r>
+        <w:rPr>
+          <w:lang w:val="en-US"/>
+        </w:rPr>
+        <w:t>results</w:t>
+      </w:r>
+      <w:r>
+        <w:rPr>
+          <w:lang w:val="en-US"/>
+        </w:rPr>
+        <w:t xml:space="preserve"> </w:t>
+      </w:r>
+      <w:r>
+        <w:rPr>
+          <w:lang w:val="en-US"/>
+        </w:rPr>
+        <w:t>also</w:t>
+      </w:r>
+      <w:r>
+        <w:rPr>
+          <w:lang w:val="en-US"/>
+        </w:rPr>
+        <w:t xml:space="preserve"> </w:t>
+      </w:r>
+      <w:r>
+        <w:rPr>
+          <w:lang w:val="en-US"/>
+        </w:rPr>
+        <w:t>showed</w:t>
+      </w:r>
+      <w:r>
+        <w:rPr>
+          <w:lang w:val="en-US"/>
+        </w:rPr>
+        <w:t xml:space="preserve"> </w:t>
+      </w:r>
+      <w:r>
+        <w:rPr>
+          <w:lang w:val="en-US"/>
+        </w:rPr>
+        <w:t>that</w:t>
+      </w:r>
+      <w:r>
+        <w:rPr>
+          <w:lang w:val="en-US"/>
+        </w:rPr>
+        <w:t xml:space="preserve"> </w:t>
+      </w:r>
+      <w:r>
+        <w:rPr>
+          <w:lang w:val="en-US"/>
+        </w:rPr>
+        <w:t>advantage</w:t>
+      </w:r>
+      <w:r>
+        <w:rPr>
+          <w:lang w:val="en-US"/>
+        </w:rPr>
+        <w:t xml:space="preserve"> </w:t>
+      </w:r>
+      <w:r>
+        <w:rPr>
+          <w:lang w:val="en-US"/>
+        </w:rPr>
+        <w:t>normalization</w:t>
+      </w:r>
+      <w:r>
+        <w:rPr>
+          <w:lang w:val="en-US"/>
+        </w:rPr>
+        <w:t xml:space="preserve"> is </w:t>
+      </w:r>
+      <w:r>
+        <w:rPr>
+          <w:lang w:val="en-US"/>
+        </w:rPr>
+        <w:t>useful</w:t>
+      </w:r>
+      <w:r>
+        <w:rPr>
+          <w:lang w:val="en-US"/>
+        </w:rPr>
+        <w:t xml:space="preserve"> </w:t>
+      </w:r>
+      <w:r>
+        <w:rPr>
+          <w:lang w:val="en-US"/>
+        </w:rPr>
+        <w:t>for</w:t>
+      </w:r>
+      <w:r>
+        <w:rPr>
+          <w:lang w:val="en-US"/>
+        </w:rPr>
+        <w:t xml:space="preserve"> </w:t>
+      </w:r>
+      <w:r>
+        <w:rPr>
+          <w:lang w:val="en-US"/>
+        </w:rPr>
+        <w:t>stabilizing</w:t>
+      </w:r>
+      <w:r>
+        <w:rPr>
+          <w:lang w:val="en-US"/>
+        </w:rPr>
+        <w:t xml:space="preserve"> A2C, </w:t>
+      </w:r>
+      <w:r>
+        <w:rPr>
+          <w:lang w:val="en-US"/>
+        </w:rPr>
+        <w:t>while</w:t>
+      </w:r>
+      <w:r>
+        <w:rPr>
+          <w:lang w:val="en-US"/>
+        </w:rPr>
+        <w:t xml:space="preserve"> </w:t>
+      </w:r>
+      <w:r>
+        <w:rPr>
+          <w:lang w:val="en-US"/>
+        </w:rPr>
+        <w:t>behavior</w:t>
+      </w:r>
+      <w:r>
+        <w:rPr>
+          <w:lang w:val="en-US"/>
+        </w:rPr>
+        <w:t xml:space="preserve"> </w:t>
+      </w:r>
+      <w:r>
+        <w:rPr>
+          <w:lang w:val="en-US"/>
+        </w:rPr>
+        <w:t>cloning</w:t>
+      </w:r>
+      <w:r>
+        <w:rPr>
+          <w:lang w:val="en-US"/>
+        </w:rPr>
+        <w:t xml:space="preserve"> </w:t>
+      </w:r>
+      <w:r>
+        <w:rPr>
+          <w:lang w:val="en-US"/>
+        </w:rPr>
+        <w:t>warm</w:t>
+      </w:r>
+      <w:r>
+        <w:rPr>
+          <w:lang w:val="en-US"/>
+        </w:rPr>
+        <w:t xml:space="preserve">-start </w:t>
+      </w:r>
+      <w:r>
+        <w:rPr>
+          <w:lang w:val="en-US"/>
+        </w:rPr>
+        <w:t>needs</w:t>
+      </w:r>
+      <w:r>
+        <w:rPr>
+          <w:lang w:val="en-US"/>
+        </w:rPr>
+        <w:t xml:space="preserve"> </w:t>
+      </w:r>
+      <w:r>
+        <w:rPr>
+          <w:lang w:val="en-US"/>
+        </w:rPr>
+        <w:t>stronger</w:t>
+      </w:r>
+      <w:r>
+        <w:rPr>
+          <w:lang w:val="en-US"/>
+        </w:rPr>
+        <w:t xml:space="preserve"> </w:t>
+      </w:r>
+      <w:r>
+        <w:rPr>
+          <w:lang w:val="en-US"/>
+        </w:rPr>
+        <w:t>imitation</w:t>
+      </w:r>
+      <w:r>
+        <w:rPr>
+          <w:lang w:val="en-US"/>
+        </w:rPr>
+        <w:t xml:space="preserve"> </w:t>
+      </w:r>
+      <w:r>
+        <w:rPr>
+          <w:lang w:val="en-US"/>
+        </w:rPr>
+        <w:t>accuracy</w:t>
+      </w:r>
+      <w:r>
+        <w:rPr>
+          <w:lang w:val="en-US"/>
+        </w:rPr>
+        <w:t xml:space="preserve"> </w:t>
+      </w:r>
+      <w:r>
+        <w:rPr>
+          <w:lang w:val="en-US"/>
+        </w:rPr>
+        <w:t>to</w:t>
+      </w:r>
+      <w:r>
+        <w:rPr>
+          <w:lang w:val="en-US"/>
+        </w:rPr>
+        <w:t xml:space="preserve"> </w:t>
+      </w:r>
+      <w:r>
+        <w:rPr>
+          <w:lang w:val="en-US"/>
+        </w:rPr>
+        <w:t>become</w:t>
+      </w:r>
+      <w:r>
+        <w:rPr>
+          <w:lang w:val="en-US"/>
+        </w:rPr>
+        <w:t xml:space="preserve"> </w:t>
+      </w:r>
+      <w:r>
+        <w:rPr>
+          <w:lang w:val="en-US"/>
+        </w:rPr>
+        <w:t>effective</w:t>
+      </w:r>
+      <w:r>
+        <w:rPr>
+          <w:lang w:val="en-US"/>
+        </w:rPr>
+        <w:t>.</w:t>
+      </w:r>
+      <w:r>
+        <w:br/>
+      </w:r>
+      <w:r>
+        <w:br/>
+      </w:r>
+      <w:r>
+        <w:rPr>
+          <w:rFonts w:ascii="Times New Roman" w:hAnsi="Times New Roman" w:eastAsia="Times New Roman" w:cs="Times New Roman"/>
+          <w:noProof w:val="0"/>
+          <w:sz w:val="24"/>
+          <w:szCs w:val="24"/>
+          <w:lang w:val="en-US"/>
+        </w:rPr>
+        <w:t>3.7 Implementation and Debugging Process</w:t>
       </w:r>
     </w:p>
     <w:p>
+      <w:r>
+        <w:rPr>
+          <w:rFonts w:ascii="Times New Roman" w:hAnsi="Times New Roman" w:eastAsia="Times New Roman" w:cs="Times New Roman"/>
+          <w:noProof w:val="0"/>
+          <w:sz w:val="24"/>
+          <w:szCs w:val="24"/>
+          <w:lang w:val="tr-TR"/>
+        </w:rPr>
+        <w:t>During Role B development, the implementation was completed step by step instead of directly writing the final model. First, the DroneDispatch-v0 environment was examined to understand the observation dictionary, discrete action space, and action mask structure. This was important because the policy network should not select invalid actions during training or evaluation.</w:t>
+      </w:r>
+    </w:p>
+    <w:p>
+      <w:r>
+        <w:rPr>
+          <w:rFonts w:ascii="Times New Roman" w:hAnsi="Times New Roman" w:eastAsia="Times New Roman" w:cs="Times New Roman"/>
+          <w:noProof w:val="0"/>
+          <w:sz w:val="24"/>
+          <w:szCs w:val="24"/>
+          <w:lang w:val="tr-TR"/>
+        </w:rPr>
+        <w:t>After understanding the environment, a simple observation flattening function was created. In the first version, drone information, order information, and time information were combined into a single state vector. The grid information was not included in this first implementation in order to keep the model simple and easier to debug.</w:t>
+      </w:r>
+    </w:p>
+    <w:p>
+      <w:r>
+        <w:rPr>
+          <w:rFonts w:ascii="Times New Roman" w:hAnsi="Times New Roman" w:eastAsia="Times New Roman" w:cs="Times New Roman"/>
+          <w:noProof w:val="0"/>
+          <w:sz w:val="24"/>
+          <w:szCs w:val="24"/>
+          <w:lang w:val="tr-TR"/>
+        </w:rPr>
+        <w:t>Then, the Actor-Critic network was implemented. The actor part produced action logits, and the critic part estimated the state value. Invalid actions were masked before sampling an action. This step was necessary because the dispatching environment contains many actions that are not valid at every decision step.</w:t>
+      </w:r>
+    </w:p>
+    <w:p>
+      <w:r>
+        <w:rPr>
+          <w:rFonts w:ascii="Times New Roman" w:hAnsi="Times New Roman" w:eastAsia="Times New Roman" w:cs="Times New Roman"/>
+          <w:noProof w:val="0"/>
+          <w:sz w:val="24"/>
+          <w:szCs w:val="24"/>
+          <w:lang w:val="tr-TR"/>
+        </w:rPr>
+        <w:t>During implementation, a local dependency problem occurred with the PyTorch optimizer module. Since torch.optim.Adam could not be used reliably in the available environment, a small ManualAdam optimizer was implemented. This allowed the A2C training script to run without changing the main learning logic.</w:t>
+      </w:r>
+    </w:p>
+    <w:p>
+      <w:r>
+        <w:rPr>
+          <w:rFonts w:ascii="Times New Roman" w:hAnsi="Times New Roman" w:eastAsia="Times New Roman" w:cs="Times New Roman"/>
+          <w:noProof w:val="0"/>
+          <w:sz w:val="24"/>
+          <w:szCs w:val="24"/>
+          <w:lang w:val="tr-TR"/>
+        </w:rPr>
+        <w:t>After the vanilla A2C pipeline was working, the model was trained and evaluated. The first results showed that the policy was technically working, but its performance was not competitive with the Greedy Nearest baseline. Because of this, behavior cloning from the Greedy Nearest policy was added as a warm-start strategy. The goal was to initialize the actor with more meaningful dispatching behavior before reinforcement learning fine-tuning.</w:t>
+      </w:r>
+    </w:p>
+    <w:p>
+      <w:r>
+        <w:rPr>
+          <w:rFonts w:ascii="Times New Roman" w:hAnsi="Times New Roman" w:eastAsia="Times New Roman" w:cs="Times New Roman"/>
+          <w:noProof w:val="0"/>
+          <w:sz w:val="24"/>
+          <w:szCs w:val="24"/>
+          <w:lang w:val="tr-TR"/>
+        </w:rPr>
+        <w:t>Finally, an ablation experiment was added by removing advantage normalization. This was done to understand whether advantage normalization had a stabilizing effect on A2C training. The results showed that removing advantage normalization increased the cost per order, so this component was useful for learning stability.</w:t>
+      </w:r>
+    </w:p>
+    <w:p>
+      <w:pPr>
+        <w:pStyle w:val="Normal"/>
+        <w:rPr>
+          <w:rFonts w:ascii="Times New Roman" w:hAnsi="Times New Roman" w:eastAsia="Times New Roman" w:cs="Times New Roman"/>
+          <w:noProof w:val="0"/>
+          <w:sz w:val="24"/>
+          <w:szCs w:val="24"/>
+          <w:lang w:val="en-US"/>
+        </w:rPr>
+      </w:pPr>
+    </w:p>
+    <w:p>
+      <w:pPr>
+        <w:pStyle w:val="Normal"/>
+        <w:rPr>
+          <w:rFonts w:ascii="Times New Roman" w:hAnsi="Times New Roman" w:eastAsia="Times New Roman" w:cs="Times New Roman"/>
+          <w:noProof w:val="0"/>
+          <w:sz w:val="24"/>
+          <w:szCs w:val="24"/>
+          <w:lang w:val="tr-TR"/>
+        </w:rPr>
+      </w:pPr>
+      <w:r>
+        <w:rPr>
+          <w:rFonts w:ascii="Times New Roman" w:hAnsi="Times New Roman" w:eastAsia="Times New Roman" w:cs="Times New Roman"/>
+          <w:noProof w:val="0"/>
+          <w:sz w:val="24"/>
+          <w:szCs w:val="24"/>
+          <w:lang w:val="en-US"/>
+        </w:rPr>
+        <w:t>3.8 Visual Analysis</w:t>
+      </w:r>
+    </w:p>
+    <w:tbl>
+      <w:tblPr>
+        <w:tblStyle w:val="TabloKlavuzu"/>
+        <w:tblW w:w="0" w:type="auto"/>
+        <w:tblLook w:val="06A0" w:firstRow="1" w:lastRow="0" w:firstColumn="1" w:lastColumn="0" w:noHBand="1" w:noVBand="1"/>
+      </w:tblPr>
+      <w:tblGrid>
+        <w:gridCol w:w="9060"/>
+      </w:tblGrid>
+      <w:tr>
+        <w:trPr>
+          <w:trHeight w:val="300"/>
+        </w:trPr>
+        <w:tc>
+          <w:tcPr>
+            <w:tcW w:w="9060" w:type="dxa"/>
+            <w:tcMar/>
+          </w:tcPr>
+          <w:p>
+            <w:pPr>
+              <w:pStyle w:val="Normal"/>
+              <w:jc w:val="center"/>
+              <w:rPr>
+                <w:rFonts w:ascii="Times New Roman" w:hAnsi="Times New Roman" w:eastAsia="Times New Roman" w:cs="Times New Roman"/>
+                <w:noProof w:val="0"/>
+                <w:sz w:val="24"/>
+                <w:szCs w:val="24"/>
+                <w:lang w:val="en-US"/>
+              </w:rPr>
+            </w:pPr>
+            <w:r>
+              <w:drawing>
+                <wp:inline wp14:editId="1A2B13E8" wp14:anchorId="0D6917CC">
+                  <wp:extent cx="5193506" cy="2848052"/>
+                  <wp:effectExtent l="0" t="0" r="0" b="0"/>
+                  <wp:docPr id="545847627" name="drawing"/>
+                  <wp:cNvGraphicFramePr>
+                    <a:graphicFrameLocks noChangeAspect="1"/>
+                  </wp:cNvGraphicFramePr>
+                  <a:graphic>
+                    <a:graphicData xmlns:a="http://schemas.openxmlformats.org/drawingml/2006/main" uri="http://schemas.openxmlformats.org/drawingml/2006/picture">
+                      <pic:pic xmlns:pic="http://schemas.openxmlformats.org/drawingml/2006/picture">
+                        <pic:nvPicPr xmlns:pic="http://schemas.openxmlformats.org/drawingml/2006/picture">
+                          <pic:cNvPr xmlns:pic="http://schemas.openxmlformats.org/drawingml/2006/picture" id="545847627" name="Picture 545847627"/>
+                          <pic:cNvPicPr xmlns:pic="http://schemas.openxmlformats.org/drawingml/2006/picture"/>
+                        </pic:nvPicPr>
+                        <pic:blipFill xmlns:pic="http://schemas.openxmlformats.org/drawingml/2006/picture">
+                          <a:blip xmlns:r="http://schemas.openxmlformats.org/officeDocument/2006/relationships" xmlns:a="http://schemas.openxmlformats.org/drawingml/2006/main" r:embed="rId214890271">
+                            <a:extLst xmlns:a="http://schemas.openxmlformats.org/drawingml/2006/main">
+                              <a:ext xmlns:a="http://schemas.openxmlformats.org/drawingml/2006/main" uri="{28A0092B-C50C-407E-A947-70E740481C1C}">
+                                <a14:useLocalDpi xmlns:a14="http://schemas.microsoft.com/office/drawing/2010/main"/>
+                              </a:ext>
+                            </a:extLst>
+                          </a:blip>
+                          <a:stretch xmlns:a="http://schemas.openxmlformats.org/drawingml/2006/main">
+                            <a:fillRect xmlns:a="http://schemas.openxmlformats.org/drawingml/2006/main"/>
+                          </a:stretch>
+                        </pic:blipFill>
+                        <pic:spPr xmlns:pic="http://schemas.openxmlformats.org/drawingml/2006/picture">
+                          <a:xfrm xmlns:a="http://schemas.openxmlformats.org/drawingml/2006/main" rot="0">
+                            <a:off xmlns:a="http://schemas.openxmlformats.org/drawingml/2006/main" x="0" y="0"/>
+                            <a:ext xmlns:a="http://schemas.openxmlformats.org/drawingml/2006/main" cx="5193506" cy="2848052"/>
+                          </a:xfrm>
+                          <a:prstGeom xmlns:a="http://schemas.openxmlformats.org/drawingml/2006/main" prst="rect">
+                            <a:avLst xmlns:a="http://schemas.openxmlformats.org/drawingml/2006/main"/>
+                          </a:prstGeom>
+                        </pic:spPr>
+                      </pic:pic>
+                    </a:graphicData>
+                  </a:graphic>
+                </wp:inline>
+              </w:drawing>
+            </w:r>
+          </w:p>
+        </w:tc>
+      </w:tr>
+      <w:tr>
+        <w:trPr>
+          <w:trHeight w:val="300"/>
+        </w:trPr>
+        <w:tc>
+          <w:tcPr>
+            <w:tcW w:w="9060" w:type="dxa"/>
+            <w:tcMar/>
+          </w:tcPr>
+          <w:p>
+            <w:pPr>
+              <w:pStyle w:val="Normal"/>
+              <w:jc w:val="center"/>
+            </w:pPr>
+            <w:r>
+              <w:rPr>
+                <w:rFonts w:ascii="Times New Roman" w:hAnsi="Times New Roman" w:eastAsia="Times New Roman" w:cs="Times New Roman"/>
+                <w:noProof w:val="0"/>
+                <w:sz w:val="24"/>
+                <w:szCs w:val="24"/>
+                <w:lang w:val="en-US"/>
+              </w:rPr>
+              <w:t>Figure B.1. Cost per order comparison for Role B methods and baselines. Lower values are better.</w:t>
+            </w:r>
+          </w:p>
+        </w:tc>
+      </w:tr>
+    </w:tbl>
+    <w:p>
+      <w:pPr>
+        <w:pStyle w:val="Normal"/>
+        <w:suppressLineNumbers w:val="0"/>
+        <w:bidi w:val="0"/>
+        <w:spacing w:before="0" w:beforeAutospacing="off" w:after="160" w:afterAutospacing="off" w:line="278" w:lineRule="auto"/>
+        <w:ind w:left="0" w:right="0"/>
+        <w:jc w:val="left"/>
+        <w:rPr>
+          <w:rFonts w:ascii="Times New Roman" w:hAnsi="Times New Roman" w:eastAsia="Times New Roman" w:cs="Times New Roman"/>
+          <w:noProof w:val="0"/>
+          <w:sz w:val="24"/>
+          <w:szCs w:val="24"/>
+          <w:lang w:val="en-US"/>
+        </w:rPr>
+      </w:pPr>
+    </w:p>
+    <w:tbl>
+      <w:tblPr>
+        <w:tblStyle w:val="TabloKlavuzu"/>
+        <w:bidiVisual w:val="0"/>
+        <w:tblW w:w="0" w:type="auto"/>
+        <w:tblLook w:val="06A0" w:firstRow="1" w:lastRow="0" w:firstColumn="1" w:lastColumn="0" w:noHBand="1" w:noVBand="1"/>
+      </w:tblPr>
+      <w:tblGrid>
+        <w:gridCol w:w="9060"/>
+      </w:tblGrid>
+      <w:tr>
+        <w:trPr>
+          <w:trHeight w:val="300"/>
+        </w:trPr>
+        <w:tc>
+          <w:tcPr>
+            <w:tcW w:w="9060" w:type="dxa"/>
+            <w:tcMar/>
+          </w:tcPr>
+          <w:p>
+            <w:pPr>
+              <w:pStyle w:val="Normal"/>
+              <w:bidi w:val="0"/>
+              <w:rPr>
+                <w:rFonts w:ascii="Times New Roman" w:hAnsi="Times New Roman" w:eastAsia="Times New Roman" w:cs="Times New Roman"/>
+                <w:noProof w:val="0"/>
+                <w:sz w:val="24"/>
+                <w:szCs w:val="24"/>
+                <w:lang w:val="en-US"/>
+              </w:rPr>
+            </w:pPr>
+            <w:r>
+              <w:drawing>
+                <wp:inline wp14:editId="73E34CC7" wp14:anchorId="693A9D2B">
+                  <wp:extent cx="5610225" cy="2771775"/>
+                  <wp:effectExtent l="0" t="0" r="0" b="0"/>
+                  <wp:docPr id="2046047859" name="drawing"/>
+                  <wp:cNvGraphicFramePr>
+                    <a:graphicFrameLocks noChangeAspect="1"/>
+                  </wp:cNvGraphicFramePr>
+                  <a:graphic>
+                    <a:graphicData xmlns:a="http://schemas.openxmlformats.org/drawingml/2006/main" uri="http://schemas.openxmlformats.org/drawingml/2006/picture">
+                      <pic:pic xmlns:pic="http://schemas.openxmlformats.org/drawingml/2006/picture">
+                        <pic:nvPicPr xmlns:pic="http://schemas.openxmlformats.org/drawingml/2006/picture">
+                          <pic:cNvPr xmlns:pic="http://schemas.openxmlformats.org/drawingml/2006/picture" id="2046047859" name="Picture 2046047859"/>
+                          <pic:cNvPicPr xmlns:pic="http://schemas.openxmlformats.org/drawingml/2006/picture"/>
+                        </pic:nvPicPr>
+                        <pic:blipFill xmlns:pic="http://schemas.openxmlformats.org/drawingml/2006/picture">
+                          <a:blip xmlns:r="http://schemas.openxmlformats.org/officeDocument/2006/relationships" xmlns:a="http://schemas.openxmlformats.org/drawingml/2006/main" r:embed="rId988788342">
+                            <a:extLst xmlns:a="http://schemas.openxmlformats.org/drawingml/2006/main">
+                              <a:ext xmlns:a="http://schemas.openxmlformats.org/drawingml/2006/main" uri="{28A0092B-C50C-407E-A947-70E740481C1C}">
+                                <a14:useLocalDpi xmlns:a14="http://schemas.microsoft.com/office/drawing/2010/main"/>
+                              </a:ext>
+                            </a:extLst>
+                          </a:blip>
+                          <a:stretch xmlns:a="http://schemas.openxmlformats.org/drawingml/2006/main">
+                            <a:fillRect xmlns:a="http://schemas.openxmlformats.org/drawingml/2006/main"/>
+                          </a:stretch>
+                        </pic:blipFill>
+                        <pic:spPr xmlns:pic="http://schemas.openxmlformats.org/drawingml/2006/picture">
+                          <a:xfrm xmlns:a="http://schemas.openxmlformats.org/drawingml/2006/main">
+                            <a:off xmlns:a="http://schemas.openxmlformats.org/drawingml/2006/main" x="0" y="0"/>
+                            <a:ext xmlns:a="http://schemas.openxmlformats.org/drawingml/2006/main" cx="5610225" cy="2771775"/>
+                          </a:xfrm>
+                          <a:prstGeom xmlns:a="http://schemas.openxmlformats.org/drawingml/2006/main" prst="rect">
+                            <a:avLst xmlns:a="http://schemas.openxmlformats.org/drawingml/2006/main"/>
+                          </a:prstGeom>
+                        </pic:spPr>
+                      </pic:pic>
+                    </a:graphicData>
+                  </a:graphic>
+                </wp:inline>
+              </w:drawing>
+            </w:r>
+          </w:p>
+        </w:tc>
+      </w:tr>
+      <w:tr>
+        <w:trPr>
+          <w:trHeight w:val="300"/>
+        </w:trPr>
+        <w:tc>
+          <w:tcPr>
+            <w:tcW w:w="9060" w:type="dxa"/>
+            <w:tcMar/>
+          </w:tcPr>
+          <w:p>
+            <w:pPr>
+              <w:pStyle w:val="Normal"/>
+              <w:bidi w:val="0"/>
+              <w:jc w:val="center"/>
+            </w:pPr>
+            <w:r>
+              <w:rPr>
+                <w:rFonts w:ascii="Times New Roman" w:hAnsi="Times New Roman" w:eastAsia="Times New Roman" w:cs="Times New Roman"/>
+                <w:noProof w:val="0"/>
+                <w:sz w:val="24"/>
+                <w:szCs w:val="24"/>
+                <w:lang w:val="en-US"/>
+              </w:rPr>
+              <w:t>Figure B.2. Delivered and dropped orders for Role B methods and baselines.</w:t>
+            </w:r>
+          </w:p>
+        </w:tc>
+      </w:tr>
+    </w:tbl>
+    <w:p>
+      <w:pPr>
+        <w:pStyle w:val="Normal"/>
+        <w:suppressLineNumbers w:val="0"/>
+        <w:bidi w:val="0"/>
+        <w:spacing w:before="0" w:beforeAutospacing="off" w:after="160" w:afterAutospacing="off" w:line="278" w:lineRule="auto"/>
+        <w:ind w:left="0" w:right="0"/>
+        <w:jc w:val="left"/>
+        <w:rPr>
+          <w:rFonts w:ascii="Times New Roman" w:hAnsi="Times New Roman" w:eastAsia="Times New Roman" w:cs="Times New Roman"/>
+          <w:noProof w:val="0"/>
+          <w:sz w:val="24"/>
+          <w:szCs w:val="24"/>
+          <w:lang w:val="en-US"/>
+        </w:rPr>
+      </w:pPr>
+    </w:p>
+    <w:p>
+      <w:pPr>
+        <w:ind w:left="0"/>
+      </w:pPr>
       <w:r>
         <w:br w:type="page"/>
       </w:r>
@@ -18112,7 +19186,7 @@
     <w:p/>
     <w:p/>
     <w:sectPr>
-      <w:pgSz w:w="11906" w:h="16838"/>
+      <w:pgSz w:w="11906" w:h="16838" w:orient="portrait"/>
       <w:pgMar w:top="1417" w:right="1417" w:bottom="1417" w:left="1417" w:header="708" w:footer="708" w:gutter="0"/>
       <w:cols w:space="708"/>
       <w:docGrid w:linePitch="360"/>
@@ -18252,7 +19326,7 @@
         <w:ind w:left="720" w:hanging="360"/>
       </w:pPr>
       <w:rPr>
-        <w:rFonts w:ascii="Symbol" w:hAnsi="Symbol" w:hint="default"/>
+        <w:rFonts w:hint="default" w:ascii="Symbol" w:hAnsi="Symbol"/>
         <w:sz w:val="20"/>
       </w:rPr>
     </w:lvl>
@@ -18268,7 +19342,7 @@
         <w:ind w:left="1440" w:hanging="360"/>
       </w:pPr>
       <w:rPr>
-        <w:rFonts w:ascii="Courier New" w:hAnsi="Courier New" w:hint="default"/>
+        <w:rFonts w:hint="default" w:ascii="Courier New" w:hAnsi="Courier New"/>
         <w:sz w:val="20"/>
       </w:rPr>
     </w:lvl>
@@ -18284,7 +19358,7 @@
         <w:ind w:left="2160" w:hanging="360"/>
       </w:pPr>
       <w:rPr>
-        <w:rFonts w:ascii="Wingdings" w:hAnsi="Wingdings" w:hint="default"/>
+        <w:rFonts w:hint="default" w:ascii="Wingdings" w:hAnsi="Wingdings"/>
         <w:sz w:val="20"/>
       </w:rPr>
     </w:lvl>
@@ -18300,7 +19374,7 @@
         <w:ind w:left="2880" w:hanging="360"/>
       </w:pPr>
       <w:rPr>
-        <w:rFonts w:ascii="Wingdings" w:hAnsi="Wingdings" w:hint="default"/>
+        <w:rFonts w:hint="default" w:ascii="Wingdings" w:hAnsi="Wingdings"/>
         <w:sz w:val="20"/>
       </w:rPr>
     </w:lvl>
@@ -18316,7 +19390,7 @@
         <w:ind w:left="3600" w:hanging="360"/>
       </w:pPr>
       <w:rPr>
-        <w:rFonts w:ascii="Wingdings" w:hAnsi="Wingdings" w:hint="default"/>
+        <w:rFonts w:hint="default" w:ascii="Wingdings" w:hAnsi="Wingdings"/>
         <w:sz w:val="20"/>
       </w:rPr>
     </w:lvl>
@@ -18332,7 +19406,7 @@
         <w:ind w:left="4320" w:hanging="360"/>
       </w:pPr>
       <w:rPr>
-        <w:rFonts w:ascii="Wingdings" w:hAnsi="Wingdings" w:hint="default"/>
+        <w:rFonts w:hint="default" w:ascii="Wingdings" w:hAnsi="Wingdings"/>
         <w:sz w:val="20"/>
       </w:rPr>
     </w:lvl>
@@ -18348,7 +19422,7 @@
         <w:ind w:left="5040" w:hanging="360"/>
       </w:pPr>
       <w:rPr>
-        <w:rFonts w:ascii="Wingdings" w:hAnsi="Wingdings" w:hint="default"/>
+        <w:rFonts w:hint="default" w:ascii="Wingdings" w:hAnsi="Wingdings"/>
         <w:sz w:val="20"/>
       </w:rPr>
     </w:lvl>
@@ -18364,7 +19438,7 @@
         <w:ind w:left="5760" w:hanging="360"/>
       </w:pPr>
       <w:rPr>
-        <w:rFonts w:ascii="Wingdings" w:hAnsi="Wingdings" w:hint="default"/>
+        <w:rFonts w:hint="default" w:ascii="Wingdings" w:hAnsi="Wingdings"/>
         <w:sz w:val="20"/>
       </w:rPr>
     </w:lvl>
@@ -18380,7 +19454,7 @@
         <w:ind w:left="6480" w:hanging="360"/>
       </w:pPr>
       <w:rPr>
-        <w:rFonts w:ascii="Wingdings" w:hAnsi="Wingdings" w:hint="default"/>
+        <w:rFonts w:hint="default" w:ascii="Wingdings" w:hAnsi="Wingdings"/>
         <w:sz w:val="20"/>
       </w:rPr>
     </w:lvl>
@@ -18401,7 +19475,7 @@
         <w:ind w:left="720" w:hanging="360"/>
       </w:pPr>
       <w:rPr>
-        <w:rFonts w:ascii="Symbol" w:hAnsi="Symbol" w:hint="default"/>
+        <w:rFonts w:hint="default" w:ascii="Symbol" w:hAnsi="Symbol"/>
         <w:sz w:val="20"/>
       </w:rPr>
     </w:lvl>
@@ -18417,7 +19491,7 @@
         <w:ind w:left="1440" w:hanging="360"/>
       </w:pPr>
       <w:rPr>
-        <w:rFonts w:ascii="Courier New" w:hAnsi="Courier New" w:hint="default"/>
+        <w:rFonts w:hint="default" w:ascii="Courier New" w:hAnsi="Courier New"/>
         <w:sz w:val="20"/>
       </w:rPr>
     </w:lvl>
@@ -18433,7 +19507,7 @@
         <w:ind w:left="2160" w:hanging="360"/>
       </w:pPr>
       <w:rPr>
-        <w:rFonts w:ascii="Wingdings" w:hAnsi="Wingdings" w:hint="default"/>
+        <w:rFonts w:hint="default" w:ascii="Wingdings" w:hAnsi="Wingdings"/>
         <w:sz w:val="20"/>
       </w:rPr>
     </w:lvl>
@@ -18449,7 +19523,7 @@
         <w:ind w:left="2880" w:hanging="360"/>
       </w:pPr>
       <w:rPr>
-        <w:rFonts w:ascii="Wingdings" w:hAnsi="Wingdings" w:hint="default"/>
+        <w:rFonts w:hint="default" w:ascii="Wingdings" w:hAnsi="Wingdings"/>
         <w:sz w:val="20"/>
       </w:rPr>
     </w:lvl>
@@ -18465,7 +19539,7 @@
         <w:ind w:left="3600" w:hanging="360"/>
       </w:pPr>
       <w:rPr>
-        <w:rFonts w:ascii="Wingdings" w:hAnsi="Wingdings" w:hint="default"/>
+        <w:rFonts w:hint="default" w:ascii="Wingdings" w:hAnsi="Wingdings"/>
         <w:sz w:val="20"/>
       </w:rPr>
     </w:lvl>
@@ -18481,7 +19555,7 @@
         <w:ind w:left="4320" w:hanging="360"/>
       </w:pPr>
       <w:rPr>
-        <w:rFonts w:ascii="Wingdings" w:hAnsi="Wingdings" w:hint="default"/>
+        <w:rFonts w:hint="default" w:ascii="Wingdings" w:hAnsi="Wingdings"/>
         <w:sz w:val="20"/>
       </w:rPr>
     </w:lvl>
@@ -18497,7 +19571,7 @@
         <w:ind w:left="5040" w:hanging="360"/>
       </w:pPr>
       <w:rPr>
-        <w:rFonts w:ascii="Wingdings" w:hAnsi="Wingdings" w:hint="default"/>
+        <w:rFonts w:hint="default" w:ascii="Wingdings" w:hAnsi="Wingdings"/>
         <w:sz w:val="20"/>
       </w:rPr>
     </w:lvl>
@@ -18513,7 +19587,7 @@
         <w:ind w:left="5760" w:hanging="360"/>
       </w:pPr>
       <w:rPr>
-        <w:rFonts w:ascii="Wingdings" w:hAnsi="Wingdings" w:hint="default"/>
+        <w:rFonts w:hint="default" w:ascii="Wingdings" w:hAnsi="Wingdings"/>
         <w:sz w:val="20"/>
       </w:rPr>
     </w:lvl>
@@ -18529,7 +19603,7 @@
         <w:ind w:left="6480" w:hanging="360"/>
       </w:pPr>
       <w:rPr>
-        <w:rFonts w:ascii="Wingdings" w:hAnsi="Wingdings" w:hint="default"/>
+        <w:rFonts w:hint="default" w:ascii="Wingdings" w:hAnsi="Wingdings"/>
         <w:sz w:val="20"/>
       </w:rPr>
     </w:lvl>
@@ -18671,7 +19745,7 @@
         <w:ind w:left="720" w:hanging="360"/>
       </w:pPr>
       <w:rPr>
-        <w:rFonts w:ascii="Symbol" w:hAnsi="Symbol" w:hint="default"/>
+        <w:rFonts w:hint="default" w:ascii="Symbol" w:hAnsi="Symbol"/>
         <w:sz w:val="20"/>
       </w:rPr>
     </w:lvl>
@@ -18687,7 +19761,7 @@
         <w:ind w:left="1440" w:hanging="360"/>
       </w:pPr>
       <w:rPr>
-        <w:rFonts w:ascii="Courier New" w:hAnsi="Courier New" w:hint="default"/>
+        <w:rFonts w:hint="default" w:ascii="Courier New" w:hAnsi="Courier New"/>
         <w:sz w:val="20"/>
       </w:rPr>
     </w:lvl>
@@ -18703,7 +19777,7 @@
         <w:ind w:left="2160" w:hanging="360"/>
       </w:pPr>
       <w:rPr>
-        <w:rFonts w:ascii="Wingdings" w:hAnsi="Wingdings" w:hint="default"/>
+        <w:rFonts w:hint="default" w:ascii="Wingdings" w:hAnsi="Wingdings"/>
         <w:sz w:val="20"/>
       </w:rPr>
     </w:lvl>
@@ -18719,7 +19793,7 @@
         <w:ind w:left="2880" w:hanging="360"/>
       </w:pPr>
       <w:rPr>
-        <w:rFonts w:ascii="Wingdings" w:hAnsi="Wingdings" w:hint="default"/>
+        <w:rFonts w:hint="default" w:ascii="Wingdings" w:hAnsi="Wingdings"/>
         <w:sz w:val="20"/>
       </w:rPr>
     </w:lvl>
@@ -18735,7 +19809,7 @@
         <w:ind w:left="3600" w:hanging="360"/>
       </w:pPr>
       <w:rPr>
-        <w:rFonts w:ascii="Wingdings" w:hAnsi="Wingdings" w:hint="default"/>
+        <w:rFonts w:hint="default" w:ascii="Wingdings" w:hAnsi="Wingdings"/>
         <w:sz w:val="20"/>
       </w:rPr>
     </w:lvl>
@@ -18751,7 +19825,7 @@
         <w:ind w:left="4320" w:hanging="360"/>
       </w:pPr>
       <w:rPr>
-        <w:rFonts w:ascii="Wingdings" w:hAnsi="Wingdings" w:hint="default"/>
+        <w:rFonts w:hint="default" w:ascii="Wingdings" w:hAnsi="Wingdings"/>
         <w:sz w:val="20"/>
       </w:rPr>
     </w:lvl>
@@ -18767,7 +19841,7 @@
         <w:ind w:left="5040" w:hanging="360"/>
       </w:pPr>
       <w:rPr>
-        <w:rFonts w:ascii="Wingdings" w:hAnsi="Wingdings" w:hint="default"/>
+        <w:rFonts w:hint="default" w:ascii="Wingdings" w:hAnsi="Wingdings"/>
         <w:sz w:val="20"/>
       </w:rPr>
     </w:lvl>
@@ -18783,7 +19857,7 @@
         <w:ind w:left="5760" w:hanging="360"/>
       </w:pPr>
       <w:rPr>
-        <w:rFonts w:ascii="Wingdings" w:hAnsi="Wingdings" w:hint="default"/>
+        <w:rFonts w:hint="default" w:ascii="Wingdings" w:hAnsi="Wingdings"/>
         <w:sz w:val="20"/>
       </w:rPr>
     </w:lvl>
@@ -18799,7 +19873,7 @@
         <w:ind w:left="6480" w:hanging="360"/>
       </w:pPr>
       <w:rPr>
-        <w:rFonts w:ascii="Wingdings" w:hAnsi="Wingdings" w:hint="default"/>
+        <w:rFonts w:hint="default" w:ascii="Wingdings" w:hAnsi="Wingdings"/>
         <w:sz w:val="20"/>
       </w:rPr>
     </w:lvl>
@@ -18832,7 +19906,7 @@
         <w:ind w:left="1440" w:hanging="360"/>
       </w:pPr>
       <w:rPr>
-        <w:rFonts w:ascii="Courier New" w:hAnsi="Courier New" w:hint="default"/>
+        <w:rFonts w:hint="default" w:ascii="Courier New" w:hAnsi="Courier New"/>
         <w:sz w:val="20"/>
       </w:rPr>
     </w:lvl>
@@ -18937,7 +20011,7 @@
         <w:ind w:left="720" w:hanging="360"/>
       </w:pPr>
       <w:rPr>
-        <w:rFonts w:ascii="Symbol" w:hAnsi="Symbol" w:hint="default"/>
+        <w:rFonts w:hint="default" w:ascii="Symbol" w:hAnsi="Symbol"/>
         <w:sz w:val="20"/>
       </w:rPr>
     </w:lvl>
@@ -18953,7 +20027,7 @@
         <w:ind w:left="1440" w:hanging="360"/>
       </w:pPr>
       <w:rPr>
-        <w:rFonts w:ascii="Courier New" w:hAnsi="Courier New" w:hint="default"/>
+        <w:rFonts w:hint="default" w:ascii="Courier New" w:hAnsi="Courier New"/>
         <w:sz w:val="20"/>
       </w:rPr>
     </w:lvl>
@@ -18969,7 +20043,7 @@
         <w:ind w:left="2160" w:hanging="360"/>
       </w:pPr>
       <w:rPr>
-        <w:rFonts w:ascii="Wingdings" w:hAnsi="Wingdings" w:hint="default"/>
+        <w:rFonts w:hint="default" w:ascii="Wingdings" w:hAnsi="Wingdings"/>
         <w:sz w:val="20"/>
       </w:rPr>
     </w:lvl>
@@ -18985,7 +20059,7 @@
         <w:ind w:left="2880" w:hanging="360"/>
       </w:pPr>
       <w:rPr>
-        <w:rFonts w:ascii="Wingdings" w:hAnsi="Wingdings" w:hint="default"/>
+        <w:rFonts w:hint="default" w:ascii="Wingdings" w:hAnsi="Wingdings"/>
         <w:sz w:val="20"/>
       </w:rPr>
     </w:lvl>
@@ -19001,7 +20075,7 @@
         <w:ind w:left="3600" w:hanging="360"/>
       </w:pPr>
       <w:rPr>
-        <w:rFonts w:ascii="Wingdings" w:hAnsi="Wingdings" w:hint="default"/>
+        <w:rFonts w:hint="default" w:ascii="Wingdings" w:hAnsi="Wingdings"/>
         <w:sz w:val="20"/>
       </w:rPr>
     </w:lvl>
@@ -19017,7 +20091,7 @@
         <w:ind w:left="4320" w:hanging="360"/>
       </w:pPr>
       <w:rPr>
-        <w:rFonts w:ascii="Wingdings" w:hAnsi="Wingdings" w:hint="default"/>
+        <w:rFonts w:hint="default" w:ascii="Wingdings" w:hAnsi="Wingdings"/>
         <w:sz w:val="20"/>
       </w:rPr>
     </w:lvl>
@@ -19033,7 +20107,7 @@
         <w:ind w:left="5040" w:hanging="360"/>
       </w:pPr>
       <w:rPr>
-        <w:rFonts w:ascii="Wingdings" w:hAnsi="Wingdings" w:hint="default"/>
+        <w:rFonts w:hint="default" w:ascii="Wingdings" w:hAnsi="Wingdings"/>
         <w:sz w:val="20"/>
       </w:rPr>
     </w:lvl>
@@ -19049,7 +20123,7 @@
         <w:ind w:left="5760" w:hanging="360"/>
       </w:pPr>
       <w:rPr>
-        <w:rFonts w:ascii="Wingdings" w:hAnsi="Wingdings" w:hint="default"/>
+        <w:rFonts w:hint="default" w:ascii="Wingdings" w:hAnsi="Wingdings"/>
         <w:sz w:val="20"/>
       </w:rPr>
     </w:lvl>
@@ -19065,7 +20139,7 @@
         <w:ind w:left="6480" w:hanging="360"/>
       </w:pPr>
       <w:rPr>
-        <w:rFonts w:ascii="Wingdings" w:hAnsi="Wingdings" w:hint="default"/>
+        <w:rFonts w:hint="default" w:ascii="Wingdings" w:hAnsi="Wingdings"/>
         <w:sz w:val="20"/>
       </w:rPr>
     </w:lvl>
@@ -19086,7 +20160,7 @@
         <w:ind w:left="720" w:hanging="360"/>
       </w:pPr>
       <w:rPr>
-        <w:rFonts w:ascii="Symbol" w:hAnsi="Symbol" w:hint="default"/>
+        <w:rFonts w:hint="default" w:ascii="Symbol" w:hAnsi="Symbol"/>
         <w:sz w:val="20"/>
       </w:rPr>
     </w:lvl>
@@ -19102,7 +20176,7 @@
         <w:ind w:left="1440" w:hanging="360"/>
       </w:pPr>
       <w:rPr>
-        <w:rFonts w:ascii="Courier New" w:hAnsi="Courier New" w:hint="default"/>
+        <w:rFonts w:hint="default" w:ascii="Courier New" w:hAnsi="Courier New"/>
         <w:sz w:val="20"/>
       </w:rPr>
     </w:lvl>
@@ -19118,7 +20192,7 @@
         <w:ind w:left="2160" w:hanging="360"/>
       </w:pPr>
       <w:rPr>
-        <w:rFonts w:ascii="Wingdings" w:hAnsi="Wingdings" w:hint="default"/>
+        <w:rFonts w:hint="default" w:ascii="Wingdings" w:hAnsi="Wingdings"/>
         <w:sz w:val="20"/>
       </w:rPr>
     </w:lvl>
@@ -19134,7 +20208,7 @@
         <w:ind w:left="2880" w:hanging="360"/>
       </w:pPr>
       <w:rPr>
-        <w:rFonts w:ascii="Wingdings" w:hAnsi="Wingdings" w:hint="default"/>
+        <w:rFonts w:hint="default" w:ascii="Wingdings" w:hAnsi="Wingdings"/>
         <w:sz w:val="20"/>
       </w:rPr>
     </w:lvl>
@@ -19150,7 +20224,7 @@
         <w:ind w:left="3600" w:hanging="360"/>
       </w:pPr>
       <w:rPr>
-        <w:rFonts w:ascii="Wingdings" w:hAnsi="Wingdings" w:hint="default"/>
+        <w:rFonts w:hint="default" w:ascii="Wingdings" w:hAnsi="Wingdings"/>
         <w:sz w:val="20"/>
       </w:rPr>
     </w:lvl>
@@ -19166,7 +20240,7 @@
         <w:ind w:left="4320" w:hanging="360"/>
       </w:pPr>
       <w:rPr>
-        <w:rFonts w:ascii="Wingdings" w:hAnsi="Wingdings" w:hint="default"/>
+        <w:rFonts w:hint="default" w:ascii="Wingdings" w:hAnsi="Wingdings"/>
         <w:sz w:val="20"/>
       </w:rPr>
     </w:lvl>
@@ -19182,7 +20256,7 @@
         <w:ind w:left="5040" w:hanging="360"/>
       </w:pPr>
       <w:rPr>
-        <w:rFonts w:ascii="Wingdings" w:hAnsi="Wingdings" w:hint="default"/>
+        <w:rFonts w:hint="default" w:ascii="Wingdings" w:hAnsi="Wingdings"/>
         <w:sz w:val="20"/>
       </w:rPr>
     </w:lvl>
@@ -19198,7 +20272,7 @@
         <w:ind w:left="5760" w:hanging="360"/>
       </w:pPr>
       <w:rPr>
-        <w:rFonts w:ascii="Wingdings" w:hAnsi="Wingdings" w:hint="default"/>
+        <w:rFonts w:hint="default" w:ascii="Wingdings" w:hAnsi="Wingdings"/>
         <w:sz w:val="20"/>
       </w:rPr>
     </w:lvl>
@@ -19214,7 +20288,7 @@
         <w:ind w:left="6480" w:hanging="360"/>
       </w:pPr>
       <w:rPr>
-        <w:rFonts w:ascii="Wingdings" w:hAnsi="Wingdings" w:hint="default"/>
+        <w:rFonts w:hint="default" w:ascii="Wingdings" w:hAnsi="Wingdings"/>
         <w:sz w:val="20"/>
       </w:rPr>
     </w:lvl>
@@ -19235,7 +20309,7 @@
         <w:ind w:left="720" w:hanging="360"/>
       </w:pPr>
       <w:rPr>
-        <w:rFonts w:ascii="Symbol" w:hAnsi="Symbol" w:hint="default"/>
+        <w:rFonts w:hint="default" w:ascii="Symbol" w:hAnsi="Symbol"/>
         <w:sz w:val="20"/>
       </w:rPr>
     </w:lvl>
@@ -19251,7 +20325,7 @@
         <w:ind w:left="1440" w:hanging="360"/>
       </w:pPr>
       <w:rPr>
-        <w:rFonts w:ascii="Courier New" w:hAnsi="Courier New" w:hint="default"/>
+        <w:rFonts w:hint="default" w:ascii="Courier New" w:hAnsi="Courier New"/>
         <w:sz w:val="20"/>
       </w:rPr>
     </w:lvl>
@@ -19267,7 +20341,7 @@
         <w:ind w:left="2160" w:hanging="360"/>
       </w:pPr>
       <w:rPr>
-        <w:rFonts w:ascii="Wingdings" w:hAnsi="Wingdings" w:hint="default"/>
+        <w:rFonts w:hint="default" w:ascii="Wingdings" w:hAnsi="Wingdings"/>
         <w:sz w:val="20"/>
       </w:rPr>
     </w:lvl>
@@ -19283,7 +20357,7 @@
         <w:ind w:left="2880" w:hanging="360"/>
       </w:pPr>
       <w:rPr>
-        <w:rFonts w:ascii="Wingdings" w:hAnsi="Wingdings" w:hint="default"/>
+        <w:rFonts w:hint="default" w:ascii="Wingdings" w:hAnsi="Wingdings"/>
         <w:sz w:val="20"/>
       </w:rPr>
     </w:lvl>
@@ -19299,7 +20373,7 @@
         <w:ind w:left="3600" w:hanging="360"/>
       </w:pPr>
       <w:rPr>
-        <w:rFonts w:ascii="Wingdings" w:hAnsi="Wingdings" w:hint="default"/>
+        <w:rFonts w:hint="default" w:ascii="Wingdings" w:hAnsi="Wingdings"/>
         <w:sz w:val="20"/>
       </w:rPr>
     </w:lvl>
@@ -19315,7 +20389,7 @@
         <w:ind w:left="4320" w:hanging="360"/>
       </w:pPr>
       <w:rPr>
-        <w:rFonts w:ascii="Wingdings" w:hAnsi="Wingdings" w:hint="default"/>
+        <w:rFonts w:hint="default" w:ascii="Wingdings" w:hAnsi="Wingdings"/>
         <w:sz w:val="20"/>
       </w:rPr>
     </w:lvl>
@@ -19331,7 +20405,7 @@
         <w:ind w:left="5040" w:hanging="360"/>
       </w:pPr>
       <w:rPr>
-        <w:rFonts w:ascii="Wingdings" w:hAnsi="Wingdings" w:hint="default"/>
+        <w:rFonts w:hint="default" w:ascii="Wingdings" w:hAnsi="Wingdings"/>
         <w:sz w:val="20"/>
       </w:rPr>
     </w:lvl>
@@ -19347,7 +20421,7 @@
         <w:ind w:left="5760" w:hanging="360"/>
       </w:pPr>
       <w:rPr>
-        <w:rFonts w:ascii="Wingdings" w:hAnsi="Wingdings" w:hint="default"/>
+        <w:rFonts w:hint="default" w:ascii="Wingdings" w:hAnsi="Wingdings"/>
         <w:sz w:val="20"/>
       </w:rPr>
     </w:lvl>
@@ -19363,7 +20437,7 @@
         <w:ind w:left="6480" w:hanging="360"/>
       </w:pPr>
       <w:rPr>
-        <w:rFonts w:ascii="Wingdings" w:hAnsi="Wingdings" w:hint="default"/>
+        <w:rFonts w:hint="default" w:ascii="Wingdings" w:hAnsi="Wingdings"/>
         <w:sz w:val="20"/>
       </w:rPr>
     </w:lvl>
@@ -19384,7 +20458,7 @@
         <w:ind w:left="720" w:hanging="360"/>
       </w:pPr>
       <w:rPr>
-        <w:rFonts w:ascii="Symbol" w:hAnsi="Symbol" w:hint="default"/>
+        <w:rFonts w:hint="default" w:ascii="Symbol" w:hAnsi="Symbol"/>
         <w:sz w:val="20"/>
       </w:rPr>
     </w:lvl>
@@ -19400,7 +20474,7 @@
         <w:ind w:left="1440" w:hanging="360"/>
       </w:pPr>
       <w:rPr>
-        <w:rFonts w:ascii="Courier New" w:hAnsi="Courier New" w:hint="default"/>
+        <w:rFonts w:hint="default" w:ascii="Courier New" w:hAnsi="Courier New"/>
         <w:sz w:val="20"/>
       </w:rPr>
     </w:lvl>
@@ -19416,7 +20490,7 @@
         <w:ind w:left="2160" w:hanging="360"/>
       </w:pPr>
       <w:rPr>
-        <w:rFonts w:ascii="Wingdings" w:hAnsi="Wingdings" w:hint="default"/>
+        <w:rFonts w:hint="default" w:ascii="Wingdings" w:hAnsi="Wingdings"/>
         <w:sz w:val="20"/>
       </w:rPr>
     </w:lvl>
@@ -19432,7 +20506,7 @@
         <w:ind w:left="2880" w:hanging="360"/>
       </w:pPr>
       <w:rPr>
-        <w:rFonts w:ascii="Wingdings" w:hAnsi="Wingdings" w:hint="default"/>
+        <w:rFonts w:hint="default" w:ascii="Wingdings" w:hAnsi="Wingdings"/>
         <w:sz w:val="20"/>
       </w:rPr>
     </w:lvl>
@@ -19448,7 +20522,7 @@
         <w:ind w:left="3600" w:hanging="360"/>
       </w:pPr>
       <w:rPr>
-        <w:rFonts w:ascii="Wingdings" w:hAnsi="Wingdings" w:hint="default"/>
+        <w:rFonts w:hint="default" w:ascii="Wingdings" w:hAnsi="Wingdings"/>
         <w:sz w:val="20"/>
       </w:rPr>
     </w:lvl>
@@ -19464,7 +20538,7 @@
         <w:ind w:left="4320" w:hanging="360"/>
       </w:pPr>
       <w:rPr>
-        <w:rFonts w:ascii="Wingdings" w:hAnsi="Wingdings" w:hint="default"/>
+        <w:rFonts w:hint="default" w:ascii="Wingdings" w:hAnsi="Wingdings"/>
         <w:sz w:val="20"/>
       </w:rPr>
     </w:lvl>
@@ -19480,7 +20554,7 @@
         <w:ind w:left="5040" w:hanging="360"/>
       </w:pPr>
       <w:rPr>
-        <w:rFonts w:ascii="Wingdings" w:hAnsi="Wingdings" w:hint="default"/>
+        <w:rFonts w:hint="default" w:ascii="Wingdings" w:hAnsi="Wingdings"/>
         <w:sz w:val="20"/>
       </w:rPr>
     </w:lvl>
@@ -19496,7 +20570,7 @@
         <w:ind w:left="5760" w:hanging="360"/>
       </w:pPr>
       <w:rPr>
-        <w:rFonts w:ascii="Wingdings" w:hAnsi="Wingdings" w:hint="default"/>
+        <w:rFonts w:hint="default" w:ascii="Wingdings" w:hAnsi="Wingdings"/>
         <w:sz w:val="20"/>
       </w:rPr>
     </w:lvl>
@@ -19512,7 +20586,7 @@
         <w:ind w:left="6480" w:hanging="360"/>
       </w:pPr>
       <w:rPr>
-        <w:rFonts w:ascii="Wingdings" w:hAnsi="Wingdings" w:hint="default"/>
+        <w:rFonts w:hint="default" w:ascii="Wingdings" w:hAnsi="Wingdings"/>
         <w:sz w:val="20"/>
       </w:rPr>
     </w:lvl>
@@ -19533,7 +20607,7 @@
         <w:ind w:left="720" w:hanging="360"/>
       </w:pPr>
       <w:rPr>
-        <w:rFonts w:ascii="Symbol" w:hAnsi="Symbol" w:hint="default"/>
+        <w:rFonts w:hint="default" w:ascii="Symbol" w:hAnsi="Symbol"/>
         <w:sz w:val="20"/>
       </w:rPr>
     </w:lvl>
@@ -19549,7 +20623,7 @@
         <w:ind w:left="1440" w:hanging="360"/>
       </w:pPr>
       <w:rPr>
-        <w:rFonts w:ascii="Courier New" w:hAnsi="Courier New" w:hint="default"/>
+        <w:rFonts w:hint="default" w:ascii="Courier New" w:hAnsi="Courier New"/>
         <w:sz w:val="20"/>
       </w:rPr>
     </w:lvl>
@@ -19565,7 +20639,7 @@
         <w:ind w:left="2160" w:hanging="360"/>
       </w:pPr>
       <w:rPr>
-        <w:rFonts w:ascii="Wingdings" w:hAnsi="Wingdings" w:hint="default"/>
+        <w:rFonts w:hint="default" w:ascii="Wingdings" w:hAnsi="Wingdings"/>
         <w:sz w:val="20"/>
       </w:rPr>
     </w:lvl>
@@ -19581,7 +20655,7 @@
         <w:ind w:left="2880" w:hanging="360"/>
       </w:pPr>
       <w:rPr>
-        <w:rFonts w:ascii="Wingdings" w:hAnsi="Wingdings" w:hint="default"/>
+        <w:rFonts w:hint="default" w:ascii="Wingdings" w:hAnsi="Wingdings"/>
         <w:sz w:val="20"/>
       </w:rPr>
     </w:lvl>
@@ -19597,7 +20671,7 @@
         <w:ind w:left="3600" w:hanging="360"/>
       </w:pPr>
       <w:rPr>
-        <w:rFonts w:ascii="Wingdings" w:hAnsi="Wingdings" w:hint="default"/>
+        <w:rFonts w:hint="default" w:ascii="Wingdings" w:hAnsi="Wingdings"/>
         <w:sz w:val="20"/>
       </w:rPr>
     </w:lvl>
@@ -19613,7 +20687,7 @@
         <w:ind w:left="4320" w:hanging="360"/>
       </w:pPr>
       <w:rPr>
-        <w:rFonts w:ascii="Wingdings" w:hAnsi="Wingdings" w:hint="default"/>
+        <w:rFonts w:hint="default" w:ascii="Wingdings" w:hAnsi="Wingdings"/>
         <w:sz w:val="20"/>
       </w:rPr>
     </w:lvl>
@@ -19629,7 +20703,7 @@
         <w:ind w:left="5040" w:hanging="360"/>
       </w:pPr>
       <w:rPr>
-        <w:rFonts w:ascii="Wingdings" w:hAnsi="Wingdings" w:hint="default"/>
+        <w:rFonts w:hint="default" w:ascii="Wingdings" w:hAnsi="Wingdings"/>
         <w:sz w:val="20"/>
       </w:rPr>
     </w:lvl>
@@ -19645,7 +20719,7 @@
         <w:ind w:left="5760" w:hanging="360"/>
       </w:pPr>
       <w:rPr>
-        <w:rFonts w:ascii="Wingdings" w:hAnsi="Wingdings" w:hint="default"/>
+        <w:rFonts w:hint="default" w:ascii="Wingdings" w:hAnsi="Wingdings"/>
         <w:sz w:val="20"/>
       </w:rPr>
     </w:lvl>
@@ -19661,7 +20735,7 @@
         <w:ind w:left="6480" w:hanging="360"/>
       </w:pPr>
       <w:rPr>
-        <w:rFonts w:ascii="Wingdings" w:hAnsi="Wingdings" w:hint="default"/>
+        <w:rFonts w:hint="default" w:ascii="Wingdings" w:hAnsi="Wingdings"/>
         <w:sz w:val="20"/>
       </w:rPr>
     </w:lvl>
@@ -19682,7 +20756,7 @@
         <w:ind w:left="720" w:hanging="360"/>
       </w:pPr>
       <w:rPr>
-        <w:rFonts w:ascii="Symbol" w:hAnsi="Symbol" w:hint="default"/>
+        <w:rFonts w:hint="default" w:ascii="Symbol" w:hAnsi="Symbol"/>
         <w:sz w:val="20"/>
       </w:rPr>
     </w:lvl>
@@ -19698,7 +20772,7 @@
         <w:ind w:left="1440" w:hanging="360"/>
       </w:pPr>
       <w:rPr>
-        <w:rFonts w:ascii="Courier New" w:hAnsi="Courier New" w:hint="default"/>
+        <w:rFonts w:hint="default" w:ascii="Courier New" w:hAnsi="Courier New"/>
         <w:sz w:val="20"/>
       </w:rPr>
     </w:lvl>
@@ -19714,7 +20788,7 @@
         <w:ind w:left="2160" w:hanging="360"/>
       </w:pPr>
       <w:rPr>
-        <w:rFonts w:ascii="Wingdings" w:hAnsi="Wingdings" w:hint="default"/>
+        <w:rFonts w:hint="default" w:ascii="Wingdings" w:hAnsi="Wingdings"/>
         <w:sz w:val="20"/>
       </w:rPr>
     </w:lvl>
@@ -19730,7 +20804,7 @@
         <w:ind w:left="2880" w:hanging="360"/>
       </w:pPr>
       <w:rPr>
-        <w:rFonts w:ascii="Wingdings" w:hAnsi="Wingdings" w:hint="default"/>
+        <w:rFonts w:hint="default" w:ascii="Wingdings" w:hAnsi="Wingdings"/>
         <w:sz w:val="20"/>
       </w:rPr>
     </w:lvl>
@@ -19746,7 +20820,7 @@
         <w:ind w:left="3600" w:hanging="360"/>
       </w:pPr>
       <w:rPr>
-        <w:rFonts w:ascii="Wingdings" w:hAnsi="Wingdings" w:hint="default"/>
+        <w:rFonts w:hint="default" w:ascii="Wingdings" w:hAnsi="Wingdings"/>
         <w:sz w:val="20"/>
       </w:rPr>
     </w:lvl>
@@ -19762,7 +20836,7 @@
         <w:ind w:left="4320" w:hanging="360"/>
       </w:pPr>
       <w:rPr>
-        <w:rFonts w:ascii="Wingdings" w:hAnsi="Wingdings" w:hint="default"/>
+        <w:rFonts w:hint="default" w:ascii="Wingdings" w:hAnsi="Wingdings"/>
         <w:sz w:val="20"/>
       </w:rPr>
     </w:lvl>
@@ -19778,7 +20852,7 @@
         <w:ind w:left="5040" w:hanging="360"/>
       </w:pPr>
       <w:rPr>
-        <w:rFonts w:ascii="Wingdings" w:hAnsi="Wingdings" w:hint="default"/>
+        <w:rFonts w:hint="default" w:ascii="Wingdings" w:hAnsi="Wingdings"/>
         <w:sz w:val="20"/>
       </w:rPr>
     </w:lvl>
@@ -19794,7 +20868,7 @@
         <w:ind w:left="5760" w:hanging="360"/>
       </w:pPr>
       <w:rPr>
-        <w:rFonts w:ascii="Wingdings" w:hAnsi="Wingdings" w:hint="default"/>
+        <w:rFonts w:hint="default" w:ascii="Wingdings" w:hAnsi="Wingdings"/>
         <w:sz w:val="20"/>
       </w:rPr>
     </w:lvl>
@@ -19810,7 +20884,7 @@
         <w:ind w:left="6480" w:hanging="360"/>
       </w:pPr>
       <w:rPr>
-        <w:rFonts w:ascii="Wingdings" w:hAnsi="Wingdings" w:hint="default"/>
+        <w:rFonts w:hint="default" w:ascii="Wingdings" w:hAnsi="Wingdings"/>
         <w:sz w:val="20"/>
       </w:rPr>
     </w:lvl>
@@ -19944,7 +21018,7 @@
         <w:ind w:left="720" w:hanging="360"/>
       </w:pPr>
       <w:rPr>
-        <w:rFonts w:ascii="Symbol" w:hAnsi="Symbol" w:hint="default"/>
+        <w:rFonts w:hint="default" w:ascii="Symbol" w:hAnsi="Symbol"/>
         <w:sz w:val="20"/>
       </w:rPr>
     </w:lvl>
@@ -19960,7 +21034,7 @@
         <w:ind w:left="1440" w:hanging="360"/>
       </w:pPr>
       <w:rPr>
-        <w:rFonts w:ascii="Courier New" w:hAnsi="Courier New" w:hint="default"/>
+        <w:rFonts w:hint="default" w:ascii="Courier New" w:hAnsi="Courier New"/>
         <w:sz w:val="20"/>
       </w:rPr>
     </w:lvl>
@@ -19976,7 +21050,7 @@
         <w:ind w:left="2160" w:hanging="360"/>
       </w:pPr>
       <w:rPr>
-        <w:rFonts w:ascii="Wingdings" w:hAnsi="Wingdings" w:hint="default"/>
+        <w:rFonts w:hint="default" w:ascii="Wingdings" w:hAnsi="Wingdings"/>
         <w:sz w:val="20"/>
       </w:rPr>
     </w:lvl>
@@ -19992,7 +21066,7 @@
         <w:ind w:left="2880" w:hanging="360"/>
       </w:pPr>
       <w:rPr>
-        <w:rFonts w:ascii="Wingdings" w:hAnsi="Wingdings" w:hint="default"/>
+        <w:rFonts w:hint="default" w:ascii="Wingdings" w:hAnsi="Wingdings"/>
         <w:sz w:val="20"/>
       </w:rPr>
     </w:lvl>
@@ -20008,7 +21082,7 @@
         <w:ind w:left="3600" w:hanging="360"/>
       </w:pPr>
       <w:rPr>
-        <w:rFonts w:ascii="Wingdings" w:hAnsi="Wingdings" w:hint="default"/>
+        <w:rFonts w:hint="default" w:ascii="Wingdings" w:hAnsi="Wingdings"/>
         <w:sz w:val="20"/>
       </w:rPr>
     </w:lvl>
@@ -20024,7 +21098,7 @@
         <w:ind w:left="4320" w:hanging="360"/>
       </w:pPr>
       <w:rPr>
-        <w:rFonts w:ascii="Wingdings" w:hAnsi="Wingdings" w:hint="default"/>
+        <w:rFonts w:hint="default" w:ascii="Wingdings" w:hAnsi="Wingdings"/>
         <w:sz w:val="20"/>
       </w:rPr>
     </w:lvl>
@@ -20040,7 +21114,7 @@
         <w:ind w:left="5040" w:hanging="360"/>
       </w:pPr>
       <w:rPr>
-        <w:rFonts w:ascii="Wingdings" w:hAnsi="Wingdings" w:hint="default"/>
+        <w:rFonts w:hint="default" w:ascii="Wingdings" w:hAnsi="Wingdings"/>
         <w:sz w:val="20"/>
       </w:rPr>
     </w:lvl>
@@ -20056,7 +21130,7 @@
         <w:ind w:left="5760" w:hanging="360"/>
       </w:pPr>
       <w:rPr>
-        <w:rFonts w:ascii="Wingdings" w:hAnsi="Wingdings" w:hint="default"/>
+        <w:rFonts w:hint="default" w:ascii="Wingdings" w:hAnsi="Wingdings"/>
         <w:sz w:val="20"/>
       </w:rPr>
     </w:lvl>
@@ -20072,7 +21146,7 @@
         <w:ind w:left="6480" w:hanging="360"/>
       </w:pPr>
       <w:rPr>
-        <w:rFonts w:ascii="Wingdings" w:hAnsi="Wingdings" w:hint="default"/>
+        <w:rFonts w:hint="default" w:ascii="Wingdings" w:hAnsi="Wingdings"/>
         <w:sz w:val="20"/>
       </w:rPr>
     </w:lvl>
@@ -20093,7 +21167,7 @@
         <w:ind w:left="720" w:hanging="360"/>
       </w:pPr>
       <w:rPr>
-        <w:rFonts w:ascii="Symbol" w:hAnsi="Symbol" w:hint="default"/>
+        <w:rFonts w:hint="default" w:ascii="Symbol" w:hAnsi="Symbol"/>
         <w:sz w:val="20"/>
       </w:rPr>
     </w:lvl>
@@ -20109,7 +21183,7 @@
         <w:ind w:left="1440" w:hanging="360"/>
       </w:pPr>
       <w:rPr>
-        <w:rFonts w:ascii="Courier New" w:hAnsi="Courier New" w:hint="default"/>
+        <w:rFonts w:hint="default" w:ascii="Courier New" w:hAnsi="Courier New"/>
         <w:sz w:val="20"/>
       </w:rPr>
     </w:lvl>
@@ -20125,7 +21199,7 @@
         <w:ind w:left="2160" w:hanging="360"/>
       </w:pPr>
       <w:rPr>
-        <w:rFonts w:ascii="Wingdings" w:hAnsi="Wingdings" w:hint="default"/>
+        <w:rFonts w:hint="default" w:ascii="Wingdings" w:hAnsi="Wingdings"/>
         <w:sz w:val="20"/>
       </w:rPr>
     </w:lvl>
@@ -20141,7 +21215,7 @@
         <w:ind w:left="2880" w:hanging="360"/>
       </w:pPr>
       <w:rPr>
-        <w:rFonts w:ascii="Wingdings" w:hAnsi="Wingdings" w:hint="default"/>
+        <w:rFonts w:hint="default" w:ascii="Wingdings" w:hAnsi="Wingdings"/>
         <w:sz w:val="20"/>
       </w:rPr>
     </w:lvl>
@@ -20157,7 +21231,7 @@
         <w:ind w:left="3600" w:hanging="360"/>
       </w:pPr>
       <w:rPr>
-        <w:rFonts w:ascii="Wingdings" w:hAnsi="Wingdings" w:hint="default"/>
+        <w:rFonts w:hint="default" w:ascii="Wingdings" w:hAnsi="Wingdings"/>
         <w:sz w:val="20"/>
       </w:rPr>
     </w:lvl>
@@ -20173,7 +21247,7 @@
         <w:ind w:left="4320" w:hanging="360"/>
       </w:pPr>
       <w:rPr>
-        <w:rFonts w:ascii="Wingdings" w:hAnsi="Wingdings" w:hint="default"/>
+        <w:rFonts w:hint="default" w:ascii="Wingdings" w:hAnsi="Wingdings"/>
         <w:sz w:val="20"/>
       </w:rPr>
     </w:lvl>
@@ -20189,7 +21263,7 @@
         <w:ind w:left="5040" w:hanging="360"/>
       </w:pPr>
       <w:rPr>
-        <w:rFonts w:ascii="Wingdings" w:hAnsi="Wingdings" w:hint="default"/>
+        <w:rFonts w:hint="default" w:ascii="Wingdings" w:hAnsi="Wingdings"/>
         <w:sz w:val="20"/>
       </w:rPr>
     </w:lvl>
@@ -20205,7 +21279,7 @@
         <w:ind w:left="5760" w:hanging="360"/>
       </w:pPr>
       <w:rPr>
-        <w:rFonts w:ascii="Wingdings" w:hAnsi="Wingdings" w:hint="default"/>
+        <w:rFonts w:hint="default" w:ascii="Wingdings" w:hAnsi="Wingdings"/>
         <w:sz w:val="20"/>
       </w:rPr>
     </w:lvl>
@@ -20221,7 +21295,7 @@
         <w:ind w:left="6480" w:hanging="360"/>
       </w:pPr>
       <w:rPr>
-        <w:rFonts w:ascii="Wingdings" w:hAnsi="Wingdings" w:hint="default"/>
+        <w:rFonts w:hint="default" w:ascii="Wingdings" w:hAnsi="Wingdings"/>
         <w:sz w:val="20"/>
       </w:rPr>
     </w:lvl>
@@ -20395,7 +21469,7 @@
   <w:docDefaults>
     <w:rPrDefault>
       <w:rPr>
-        <w:rFonts w:asciiTheme="minorHAnsi" w:eastAsiaTheme="minorHAnsi" w:hAnsiTheme="minorHAnsi" w:cstheme="minorBidi"/>
+        <w:rFonts w:asciiTheme="minorHAnsi" w:hAnsiTheme="minorHAnsi" w:eastAsiaTheme="minorHAnsi" w:cstheme="minorBidi"/>
         <w:kern w:val="2"/>
         <w:sz w:val="24"/>
         <w:szCs w:val="24"/>
@@ -20412,14 +21486,14 @@
   <w:latentStyles w:defLockedState="0" w:defUIPriority="99" w:defSemiHidden="0" w:defUnhideWhenUsed="0" w:defQFormat="0" w:count="376">
     <w:lsdException w:name="Normal" w:uiPriority="0" w:qFormat="1"/>
     <w:lsdException w:name="heading 1" w:uiPriority="9" w:qFormat="1"/>
-    <w:lsdException w:name="heading 2" w:semiHidden="1" w:uiPriority="9" w:unhideWhenUsed="1" w:qFormat="1"/>
-    <w:lsdException w:name="heading 3" w:semiHidden="1" w:uiPriority="9" w:unhideWhenUsed="1" w:qFormat="1"/>
-    <w:lsdException w:name="heading 4" w:semiHidden="1" w:uiPriority="9" w:unhideWhenUsed="1" w:qFormat="1"/>
-    <w:lsdException w:name="heading 5" w:semiHidden="1" w:uiPriority="9" w:unhideWhenUsed="1" w:qFormat="1"/>
-    <w:lsdException w:name="heading 6" w:semiHidden="1" w:uiPriority="9" w:unhideWhenUsed="1" w:qFormat="1"/>
-    <w:lsdException w:name="heading 7" w:semiHidden="1" w:uiPriority="9" w:unhideWhenUsed="1" w:qFormat="1"/>
-    <w:lsdException w:name="heading 8" w:semiHidden="1" w:uiPriority="9" w:unhideWhenUsed="1" w:qFormat="1"/>
-    <w:lsdException w:name="heading 9" w:semiHidden="1" w:uiPriority="9" w:unhideWhenUsed="1" w:qFormat="1"/>
+    <w:lsdException w:name="heading 2" w:uiPriority="9" w:semiHidden="1" w:unhideWhenUsed="1" w:qFormat="1"/>
+    <w:lsdException w:name="heading 3" w:uiPriority="9" w:semiHidden="1" w:unhideWhenUsed="1" w:qFormat="1"/>
+    <w:lsdException w:name="heading 4" w:uiPriority="9" w:semiHidden="1" w:unhideWhenUsed="1" w:qFormat="1"/>
+    <w:lsdException w:name="heading 5" w:uiPriority="9" w:semiHidden="1" w:unhideWhenUsed="1" w:qFormat="1"/>
+    <w:lsdException w:name="heading 6" w:uiPriority="9" w:semiHidden="1" w:unhideWhenUsed="1" w:qFormat="1"/>
+    <w:lsdException w:name="heading 7" w:uiPriority="9" w:semiHidden="1" w:unhideWhenUsed="1" w:qFormat="1"/>
+    <w:lsdException w:name="heading 8" w:uiPriority="9" w:semiHidden="1" w:unhideWhenUsed="1" w:qFormat="1"/>
+    <w:lsdException w:name="heading 9" w:uiPriority="9" w:semiHidden="1" w:unhideWhenUsed="1" w:qFormat="1"/>
     <w:lsdException w:name="index 1" w:semiHidden="1" w:unhideWhenUsed="1"/>
     <w:lsdException w:name="index 2" w:semiHidden="1" w:unhideWhenUsed="1"/>
     <w:lsdException w:name="index 3" w:semiHidden="1" w:unhideWhenUsed="1"/>
@@ -20429,22 +21503,22 @@
     <w:lsdException w:name="index 7" w:semiHidden="1" w:unhideWhenUsed="1"/>
     <w:lsdException w:name="index 8" w:semiHidden="1" w:unhideWhenUsed="1"/>
     <w:lsdException w:name="index 9" w:semiHidden="1" w:unhideWhenUsed="1"/>
-    <w:lsdException w:name="toc 1" w:semiHidden="1" w:uiPriority="39" w:unhideWhenUsed="1"/>
-    <w:lsdException w:name="toc 2" w:semiHidden="1" w:uiPriority="39" w:unhideWhenUsed="1"/>
-    <w:lsdException w:name="toc 3" w:semiHidden="1" w:uiPriority="39" w:unhideWhenUsed="1"/>
-    <w:lsdException w:name="toc 4" w:semiHidden="1" w:uiPriority="39" w:unhideWhenUsed="1"/>
-    <w:lsdException w:name="toc 5" w:semiHidden="1" w:uiPriority="39" w:unhideWhenUsed="1"/>
-    <w:lsdException w:name="toc 6" w:semiHidden="1" w:uiPriority="39" w:unhideWhenUsed="1"/>
-    <w:lsdException w:name="toc 7" w:semiHidden="1" w:uiPriority="39" w:unhideWhenUsed="1"/>
-    <w:lsdException w:name="toc 8" w:semiHidden="1" w:uiPriority="39" w:unhideWhenUsed="1"/>
-    <w:lsdException w:name="toc 9" w:semiHidden="1" w:uiPriority="39" w:unhideWhenUsed="1"/>
+    <w:lsdException w:name="toc 1" w:uiPriority="39" w:semiHidden="1" w:unhideWhenUsed="1"/>
+    <w:lsdException w:name="toc 2" w:uiPriority="39" w:semiHidden="1" w:unhideWhenUsed="1"/>
+    <w:lsdException w:name="toc 3" w:uiPriority="39" w:semiHidden="1" w:unhideWhenUsed="1"/>
+    <w:lsdException w:name="toc 4" w:uiPriority="39" w:semiHidden="1" w:unhideWhenUsed="1"/>
+    <w:lsdException w:name="toc 5" w:uiPriority="39" w:semiHidden="1" w:unhideWhenUsed="1"/>
+    <w:lsdException w:name="toc 6" w:uiPriority="39" w:semiHidden="1" w:unhideWhenUsed="1"/>
+    <w:lsdException w:name="toc 7" w:uiPriority="39" w:semiHidden="1" w:unhideWhenUsed="1"/>
+    <w:lsdException w:name="toc 8" w:uiPriority="39" w:semiHidden="1" w:unhideWhenUsed="1"/>
+    <w:lsdException w:name="toc 9" w:uiPriority="39" w:semiHidden="1" w:unhideWhenUsed="1"/>
     <w:lsdException w:name="Normal Indent" w:semiHidden="1" w:unhideWhenUsed="1"/>
     <w:lsdException w:name="footnote text" w:semiHidden="1" w:unhideWhenUsed="1"/>
     <w:lsdException w:name="annotation text" w:semiHidden="1" w:unhideWhenUsed="1"/>
     <w:lsdException w:name="header" w:semiHidden="1" w:unhideWhenUsed="1"/>
     <w:lsdException w:name="footer" w:semiHidden="1" w:unhideWhenUsed="1"/>
     <w:lsdException w:name="index heading" w:semiHidden="1" w:unhideWhenUsed="1"/>
-    <w:lsdException w:name="caption" w:semiHidden="1" w:uiPriority="35" w:unhideWhenUsed="1" w:qFormat="1"/>
+    <w:lsdException w:name="caption" w:uiPriority="35" w:semiHidden="1" w:unhideWhenUsed="1" w:qFormat="1"/>
     <w:lsdException w:name="table of figures" w:semiHidden="1" w:unhideWhenUsed="1"/>
     <w:lsdException w:name="envelope address" w:semiHidden="1" w:unhideWhenUsed="1"/>
     <w:lsdException w:name="envelope return" w:semiHidden="1" w:unhideWhenUsed="1"/>
@@ -20475,7 +21549,7 @@
     <w:lsdException w:name="Title" w:uiPriority="10" w:qFormat="1"/>
     <w:lsdException w:name="Closing" w:semiHidden="1" w:unhideWhenUsed="1"/>
     <w:lsdException w:name="Signature" w:semiHidden="1" w:unhideWhenUsed="1"/>
-    <w:lsdException w:name="Default Paragraph Font" w:semiHidden="1" w:uiPriority="1" w:unhideWhenUsed="1"/>
+    <w:lsdException w:name="Default Paragraph Font" w:uiPriority="1" w:semiHidden="1" w:unhideWhenUsed="1"/>
     <w:lsdException w:name="Body Text" w:semiHidden="1" w:unhideWhenUsed="1"/>
     <w:lsdException w:name="Body Text Indent" w:semiHidden="1" w:unhideWhenUsed="1"/>
     <w:lsdException w:name="List Continue" w:semiHidden="1" w:unhideWhenUsed="1"/>
@@ -20675,8 +21749,8 @@
     <w:lsdException w:name="Subtle Reference" w:uiPriority="31" w:qFormat="1"/>
     <w:lsdException w:name="Intense Reference" w:uiPriority="32" w:qFormat="1"/>
     <w:lsdException w:name="Book Title" w:uiPriority="33" w:qFormat="1"/>
-    <w:lsdException w:name="Bibliography" w:semiHidden="1" w:uiPriority="37" w:unhideWhenUsed="1"/>
-    <w:lsdException w:name="TOC Heading" w:semiHidden="1" w:uiPriority="39" w:unhideWhenUsed="1" w:qFormat="1"/>
+    <w:lsdException w:name="Bibliography" w:uiPriority="37" w:semiHidden="1" w:unhideWhenUsed="1"/>
+    <w:lsdException w:name="TOC Heading" w:uiPriority="39" w:semiHidden="1" w:unhideWhenUsed="1" w:qFormat="1"/>
     <w:lsdException w:name="Plain Table 1" w:uiPriority="41"/>
     <w:lsdException w:name="Plain Table 2" w:uiPriority="42"/>
     <w:lsdException w:name="Plain Table 3" w:uiPriority="43"/>
@@ -20787,7 +21861,7 @@
     <w:lsdException w:name="Unresolved Mention" w:semiHidden="1" w:unhideWhenUsed="1"/>
     <w:lsdException w:name="Smart Link" w:semiHidden="1" w:unhideWhenUsed="1"/>
   </w:latentStyles>
-  <w:style w:type="paragraph" w:default="1" w:styleId="Normal">
+  <w:style w:type="paragraph" w:styleId="Normal" w:default="1">
     <w:name w:val="Normal"/>
     <w:qFormat/>
     <w:rsid w:val="006C561F"/>
@@ -20810,7 +21884,7 @@
       <w:outlineLvl w:val="0"/>
     </w:pPr>
     <w:rPr>
-      <w:rFonts w:asciiTheme="majorHAnsi" w:eastAsiaTheme="majorEastAsia" w:hAnsiTheme="majorHAnsi" w:cstheme="majorBidi"/>
+      <w:rFonts w:asciiTheme="majorHAnsi" w:hAnsiTheme="majorHAnsi" w:eastAsiaTheme="majorEastAsia" w:cstheme="majorBidi"/>
       <w:color w:val="0F4761" w:themeColor="accent1" w:themeShade="BF"/>
       <w:sz w:val="40"/>
       <w:szCs w:val="40"/>
@@ -20833,7 +21907,7 @@
       <w:outlineLvl w:val="1"/>
     </w:pPr>
     <w:rPr>
-      <w:rFonts w:asciiTheme="majorHAnsi" w:eastAsiaTheme="majorEastAsia" w:hAnsiTheme="majorHAnsi" w:cstheme="majorBidi"/>
+      <w:rFonts w:asciiTheme="majorHAnsi" w:hAnsiTheme="majorHAnsi" w:eastAsiaTheme="majorEastAsia" w:cstheme="majorBidi"/>
       <w:color w:val="0F4761" w:themeColor="accent1" w:themeShade="BF"/>
       <w:sz w:val="32"/>
       <w:szCs w:val="32"/>
@@ -20855,7 +21929,7 @@
       <w:outlineLvl w:val="2"/>
     </w:pPr>
     <w:rPr>
-      <w:rFonts w:asciiTheme="minorHAnsi" w:eastAsiaTheme="majorEastAsia" w:hAnsiTheme="minorHAnsi" w:cstheme="majorBidi"/>
+      <w:rFonts w:asciiTheme="minorHAnsi" w:hAnsiTheme="minorHAnsi" w:eastAsiaTheme="majorEastAsia" w:cstheme="majorBidi"/>
       <w:color w:val="0F4761" w:themeColor="accent1" w:themeShade="BF"/>
       <w:sz w:val="28"/>
       <w:szCs w:val="28"/>
@@ -20878,7 +21952,7 @@
       <w:outlineLvl w:val="3"/>
     </w:pPr>
     <w:rPr>
-      <w:rFonts w:asciiTheme="minorHAnsi" w:eastAsiaTheme="majorEastAsia" w:hAnsiTheme="minorHAnsi" w:cstheme="majorBidi"/>
+      <w:rFonts w:asciiTheme="minorHAnsi" w:hAnsiTheme="minorHAnsi" w:eastAsiaTheme="majorEastAsia" w:cstheme="majorBidi"/>
       <w:i/>
       <w:iCs/>
       <w:color w:val="0F4761" w:themeColor="accent1" w:themeShade="BF"/>
@@ -20901,7 +21975,7 @@
       <w:outlineLvl w:val="4"/>
     </w:pPr>
     <w:rPr>
-      <w:rFonts w:asciiTheme="minorHAnsi" w:eastAsiaTheme="majorEastAsia" w:hAnsiTheme="minorHAnsi" w:cstheme="majorBidi"/>
+      <w:rFonts w:asciiTheme="minorHAnsi" w:hAnsiTheme="minorHAnsi" w:eastAsiaTheme="majorEastAsia" w:cstheme="majorBidi"/>
       <w:color w:val="0F4761" w:themeColor="accent1" w:themeShade="BF"/>
     </w:rPr>
   </w:style>
@@ -20922,7 +21996,7 @@
       <w:outlineLvl w:val="5"/>
     </w:pPr>
     <w:rPr>
-      <w:rFonts w:asciiTheme="minorHAnsi" w:eastAsiaTheme="majorEastAsia" w:hAnsiTheme="minorHAnsi" w:cstheme="majorBidi"/>
+      <w:rFonts w:asciiTheme="minorHAnsi" w:hAnsiTheme="minorHAnsi" w:eastAsiaTheme="majorEastAsia" w:cstheme="majorBidi"/>
       <w:i/>
       <w:iCs/>
       <w:color w:val="595959" w:themeColor="text1" w:themeTint="A6"/>
@@ -20945,7 +22019,7 @@
       <w:outlineLvl w:val="6"/>
     </w:pPr>
     <w:rPr>
-      <w:rFonts w:asciiTheme="minorHAnsi" w:eastAsiaTheme="majorEastAsia" w:hAnsiTheme="minorHAnsi" w:cstheme="majorBidi"/>
+      <w:rFonts w:asciiTheme="minorHAnsi" w:hAnsiTheme="minorHAnsi" w:eastAsiaTheme="majorEastAsia" w:cstheme="majorBidi"/>
       <w:color w:val="595959" w:themeColor="text1" w:themeTint="A6"/>
     </w:rPr>
   </w:style>
@@ -20966,7 +22040,7 @@
       <w:outlineLvl w:val="7"/>
     </w:pPr>
     <w:rPr>
-      <w:rFonts w:asciiTheme="minorHAnsi" w:eastAsiaTheme="majorEastAsia" w:hAnsiTheme="minorHAnsi" w:cstheme="majorBidi"/>
+      <w:rFonts w:asciiTheme="minorHAnsi" w:hAnsiTheme="minorHAnsi" w:eastAsiaTheme="majorEastAsia" w:cstheme="majorBidi"/>
       <w:i/>
       <w:iCs/>
       <w:color w:val="272727" w:themeColor="text1" w:themeTint="D8"/>
@@ -20989,16 +22063,16 @@
       <w:outlineLvl w:val="8"/>
     </w:pPr>
     <w:rPr>
-      <w:rFonts w:asciiTheme="minorHAnsi" w:eastAsiaTheme="majorEastAsia" w:hAnsiTheme="minorHAnsi" w:cstheme="majorBidi"/>
+      <w:rFonts w:asciiTheme="minorHAnsi" w:hAnsiTheme="minorHAnsi" w:eastAsiaTheme="majorEastAsia" w:cstheme="majorBidi"/>
       <w:color w:val="272727" w:themeColor="text1" w:themeTint="D8"/>
     </w:rPr>
   </w:style>
-  <w:style w:type="character" w:default="1" w:styleId="VarsaylanParagrafYazTipi">
+  <w:style w:type="character" w:styleId="VarsaylanParagrafYazTipi" w:default="1">
     <w:name w:val="Default Paragraph Font"/>
     <w:uiPriority w:val="1"/>
     <w:unhideWhenUsed/>
   </w:style>
-  <w:style w:type="table" w:default="1" w:styleId="NormalTablo">
+  <w:style w:type="table" w:styleId="NormalTablo" w:default="1">
     <w:name w:val="Normal Table"/>
     <w:uiPriority w:val="99"/>
     <w:semiHidden/>
@@ -21013,26 +22087,26 @@
       </w:tblCellMar>
     </w:tblPr>
   </w:style>
-  <w:style w:type="numbering" w:default="1" w:styleId="ListeYok">
+  <w:style w:type="numbering" w:styleId="ListeYok" w:default="1">
     <w:name w:val="No List"/>
     <w:uiPriority w:val="99"/>
     <w:semiHidden/>
     <w:unhideWhenUsed/>
   </w:style>
-  <w:style w:type="character" w:customStyle="1" w:styleId="Balk1Char">
+  <w:style w:type="character" w:styleId="Balk1Char" w:customStyle="1">
     <w:name w:val="Başlık 1 Char"/>
     <w:basedOn w:val="VarsaylanParagrafYazTipi"/>
     <w:link w:val="Balk1"/>
     <w:uiPriority w:val="9"/>
     <w:rsid w:val="007A3551"/>
     <w:rPr>
-      <w:rFonts w:asciiTheme="majorHAnsi" w:eastAsiaTheme="majorEastAsia" w:hAnsiTheme="majorHAnsi" w:cstheme="majorBidi"/>
+      <w:rFonts w:asciiTheme="majorHAnsi" w:hAnsiTheme="majorHAnsi" w:eastAsiaTheme="majorEastAsia" w:cstheme="majorBidi"/>
       <w:color w:val="0F4761" w:themeColor="accent1" w:themeShade="BF"/>
       <w:sz w:val="40"/>
       <w:szCs w:val="40"/>
     </w:rPr>
   </w:style>
-  <w:style w:type="character" w:customStyle="1" w:styleId="Balk2Char">
+  <w:style w:type="character" w:styleId="Balk2Char" w:customStyle="1">
     <w:name w:val="Başlık 2 Char"/>
     <w:basedOn w:val="VarsaylanParagrafYazTipi"/>
     <w:link w:val="Balk2"/>
@@ -21040,13 +22114,13 @@
     <w:semiHidden/>
     <w:rsid w:val="007A3551"/>
     <w:rPr>
-      <w:rFonts w:asciiTheme="majorHAnsi" w:eastAsiaTheme="majorEastAsia" w:hAnsiTheme="majorHAnsi" w:cstheme="majorBidi"/>
+      <w:rFonts w:asciiTheme="majorHAnsi" w:hAnsiTheme="majorHAnsi" w:eastAsiaTheme="majorEastAsia" w:cstheme="majorBidi"/>
       <w:color w:val="0F4761" w:themeColor="accent1" w:themeShade="BF"/>
       <w:sz w:val="32"/>
       <w:szCs w:val="32"/>
     </w:rPr>
   </w:style>
-  <w:style w:type="character" w:customStyle="1" w:styleId="Balk3Char">
+  <w:style w:type="character" w:styleId="Balk3Char" w:customStyle="1">
     <w:name w:val="Başlık 3 Char"/>
     <w:basedOn w:val="VarsaylanParagrafYazTipi"/>
     <w:link w:val="Balk3"/>
@@ -21059,7 +22133,7 @@
       <w:szCs w:val="28"/>
     </w:rPr>
   </w:style>
-  <w:style w:type="character" w:customStyle="1" w:styleId="Balk4Char">
+  <w:style w:type="character" w:styleId="Balk4Char" w:customStyle="1">
     <w:name w:val="Başlık 4 Char"/>
     <w:basedOn w:val="VarsaylanParagrafYazTipi"/>
     <w:link w:val="Balk4"/>
@@ -21073,7 +22147,7 @@
       <w:color w:val="0F4761" w:themeColor="accent1" w:themeShade="BF"/>
     </w:rPr>
   </w:style>
-  <w:style w:type="character" w:customStyle="1" w:styleId="Balk5Char">
+  <w:style w:type="character" w:styleId="Balk5Char" w:customStyle="1">
     <w:name w:val="Başlık 5 Char"/>
     <w:basedOn w:val="VarsaylanParagrafYazTipi"/>
     <w:link w:val="Balk5"/>
@@ -21085,7 +22159,7 @@
       <w:color w:val="0F4761" w:themeColor="accent1" w:themeShade="BF"/>
     </w:rPr>
   </w:style>
-  <w:style w:type="character" w:customStyle="1" w:styleId="Balk6Char">
+  <w:style w:type="character" w:styleId="Balk6Char" w:customStyle="1">
     <w:name w:val="Başlık 6 Char"/>
     <w:basedOn w:val="VarsaylanParagrafYazTipi"/>
     <w:link w:val="Balk6"/>
@@ -21099,7 +22173,7 @@
       <w:color w:val="595959" w:themeColor="text1" w:themeTint="A6"/>
     </w:rPr>
   </w:style>
-  <w:style w:type="character" w:customStyle="1" w:styleId="Balk7Char">
+  <w:style w:type="character" w:styleId="Balk7Char" w:customStyle="1">
     <w:name w:val="Başlık 7 Char"/>
     <w:basedOn w:val="VarsaylanParagrafYazTipi"/>
     <w:link w:val="Balk7"/>
@@ -21111,7 +22185,7 @@
       <w:color w:val="595959" w:themeColor="text1" w:themeTint="A6"/>
     </w:rPr>
   </w:style>
-  <w:style w:type="character" w:customStyle="1" w:styleId="Balk8Char">
+  <w:style w:type="character" w:styleId="Balk8Char" w:customStyle="1">
     <w:name w:val="Başlık 8 Char"/>
     <w:basedOn w:val="VarsaylanParagrafYazTipi"/>
     <w:link w:val="Balk8"/>
@@ -21125,7 +22199,7 @@
       <w:color w:val="272727" w:themeColor="text1" w:themeTint="D8"/>
     </w:rPr>
   </w:style>
-  <w:style w:type="character" w:customStyle="1" w:styleId="Balk9Char">
+  <w:style w:type="character" w:styleId="Balk9Char" w:customStyle="1">
     <w:name w:val="Başlık 9 Char"/>
     <w:basedOn w:val="VarsaylanParagrafYazTipi"/>
     <w:link w:val="Balk9"/>
@@ -21150,21 +22224,21 @@
       <w:contextualSpacing/>
     </w:pPr>
     <w:rPr>
-      <w:rFonts w:asciiTheme="majorHAnsi" w:eastAsiaTheme="majorEastAsia" w:hAnsiTheme="majorHAnsi" w:cstheme="majorBidi"/>
+      <w:rFonts w:asciiTheme="majorHAnsi" w:hAnsiTheme="majorHAnsi" w:eastAsiaTheme="majorEastAsia" w:cstheme="majorBidi"/>
       <w:spacing w:val="-10"/>
       <w:kern w:val="28"/>
       <w:sz w:val="56"/>
       <w:szCs w:val="56"/>
     </w:rPr>
   </w:style>
-  <w:style w:type="character" w:customStyle="1" w:styleId="KonuBalChar">
+  <w:style w:type="character" w:styleId="KonuBalChar" w:customStyle="1">
     <w:name w:val="Konu Başlığı Char"/>
     <w:basedOn w:val="VarsaylanParagrafYazTipi"/>
     <w:link w:val="KonuBal"/>
     <w:uiPriority w:val="10"/>
     <w:rsid w:val="007A3551"/>
     <w:rPr>
-      <w:rFonts w:asciiTheme="majorHAnsi" w:eastAsiaTheme="majorEastAsia" w:hAnsiTheme="majorHAnsi" w:cstheme="majorBidi"/>
+      <w:rFonts w:asciiTheme="majorHAnsi" w:hAnsiTheme="majorHAnsi" w:eastAsiaTheme="majorEastAsia" w:cstheme="majorBidi"/>
       <w:spacing w:val="-10"/>
       <w:kern w:val="28"/>
       <w:sz w:val="56"/>
@@ -21185,14 +22259,14 @@
       </w:numPr>
     </w:pPr>
     <w:rPr>
-      <w:rFonts w:asciiTheme="minorHAnsi" w:eastAsiaTheme="majorEastAsia" w:hAnsiTheme="minorHAnsi" w:cstheme="majorBidi"/>
+      <w:rFonts w:asciiTheme="minorHAnsi" w:hAnsiTheme="minorHAnsi" w:eastAsiaTheme="majorEastAsia" w:cstheme="majorBidi"/>
       <w:color w:val="595959" w:themeColor="text1" w:themeTint="A6"/>
       <w:spacing w:val="15"/>
       <w:sz w:val="28"/>
       <w:szCs w:val="28"/>
     </w:rPr>
   </w:style>
-  <w:style w:type="character" w:customStyle="1" w:styleId="AltyazChar">
+  <w:style w:type="character" w:styleId="AltyazChar" w:customStyle="1">
     <w:name w:val="Altyazı Char"/>
     <w:basedOn w:val="VarsaylanParagrafYazTipi"/>
     <w:link w:val="Altyaz"/>
@@ -21224,7 +22298,7 @@
       <w:color w:val="404040" w:themeColor="text1" w:themeTint="BF"/>
     </w:rPr>
   </w:style>
-  <w:style w:type="character" w:customStyle="1" w:styleId="AlntChar">
+  <w:style w:type="character" w:styleId="AlntChar" w:customStyle="1">
     <w:name w:val="Alıntı Char"/>
     <w:basedOn w:val="VarsaylanParagrafYazTipi"/>
     <w:link w:val="Alnt"/>
@@ -21270,8 +22344,8 @@
     <w:rsid w:val="007A3551"/>
     <w:pPr>
       <w:pBdr>
-        <w:top w:val="single" w:sz="4" w:space="10" w:color="0F4761" w:themeColor="accent1" w:themeShade="BF"/>
-        <w:bottom w:val="single" w:sz="4" w:space="10" w:color="0F4761" w:themeColor="accent1" w:themeShade="BF"/>
+        <w:top w:val="single" w:color="0F4761" w:themeColor="accent1" w:themeShade="BF" w:sz="4" w:space="10"/>
+        <w:bottom w:val="single" w:color="0F4761" w:themeColor="accent1" w:themeShade="BF" w:sz="4" w:space="10"/>
       </w:pBdr>
       <w:spacing w:before="360" w:after="360"/>
       <w:ind w:left="864" w:right="864"/>
@@ -21283,7 +22357,7 @@
       <w:color w:val="0F4761" w:themeColor="accent1" w:themeShade="BF"/>
     </w:rPr>
   </w:style>
-  <w:style w:type="character" w:customStyle="1" w:styleId="GlAlntChar">
+  <w:style w:type="character" w:styleId="GlAlntChar" w:customStyle="1">
     <w:name w:val="Güçlü Alıntı Char"/>
     <w:basedOn w:val="VarsaylanParagrafYazTipi"/>
     <w:link w:val="GlAlnt"/>
@@ -21310,7 +22384,7 @@
       <w:spacing w:val="5"/>
     </w:rPr>
   </w:style>
-  <w:style w:type="paragraph" w:customStyle="1" w:styleId="isselectedend">
+  <w:style w:type="paragraph" w:styleId="isselectedend" w:customStyle="1">
     <w:name w:val="isselectedend"/>
     <w:basedOn w:val="Normal"/>
     <w:rsid w:val="00336AF7"/>
@@ -21359,7 +22433,7 @@
     <w:unhideWhenUsed/>
     <w:rsid w:val="00CE57BA"/>
     <w:rPr>
-      <w:rFonts w:ascii="Courier New" w:eastAsia="Times New Roman" w:hAnsi="Courier New" w:cs="Courier New"/>
+      <w:rFonts w:ascii="Courier New" w:hAnsi="Courier New" w:eastAsia="Times New Roman" w:cs="Courier New"/>
       <w:sz w:val="20"/>
       <w:szCs w:val="20"/>
     </w:rPr>
@@ -21374,12 +22448,12 @@
     </w:pPr>
     <w:tblPr>
       <w:tblBorders>
-        <w:top w:val="single" w:sz="4" w:space="0" w:color="auto"/>
-        <w:left w:val="single" w:sz="4" w:space="0" w:color="auto"/>
-        <w:bottom w:val="single" w:sz="4" w:space="0" w:color="auto"/>
-        <w:right w:val="single" w:sz="4" w:space="0" w:color="auto"/>
-        <w:insideH w:val="single" w:sz="4" w:space="0" w:color="auto"/>
-        <w:insideV w:val="single" w:sz="4" w:space="0" w:color="auto"/>
+        <w:top w:val="single" w:color="auto" w:sz="4" w:space="0"/>
+        <w:left w:val="single" w:color="auto" w:sz="4" w:space="0"/>
+        <w:bottom w:val="single" w:color="auto" w:sz="4" w:space="0"/>
+        <w:right w:val="single" w:color="auto" w:sz="4" w:space="0"/>
+        <w:insideH w:val="single" w:color="auto" w:sz="4" w:space="0"/>
+        <w:insideV w:val="single" w:color="auto" w:sz="4" w:space="0"/>
       </w:tblBorders>
     </w:tblPr>
   </w:style>
@@ -21387,7 +22461,7 @@
 </file>
 
 <file path=word/theme/theme1.xml><?xml version="1.0" encoding="utf-8"?>
-<a:theme xmlns:a="http://schemas.openxmlformats.org/drawingml/2006/main" name="Office Teması">
+<a:theme xmlns:a="http://schemas.openxmlformats.org/drawingml/2006/main" xmlns:thm15="http://schemas.microsoft.com/office/thememl/2012/main" name="Office Teması">
   <a:themeElements>
     <a:clrScheme name="Office">
       <a:dk1>

</xml_diff>